<commit_message>
Further cleaned and updated the Thesis interviews.
</commit_message>
<xml_diff>
--- a/transcripts/Thesis Transcript Erik Hilhorst.docx
+++ b/transcripts/Thesis Transcript Erik Hilhorst.docx
@@ -21,12 +21,20 @@
         <w:pStyle w:val="BlockText"/>
       </w:pPr>
       <w:r>
-        <w:t xml:space="preserve">[Me]</w:t>
-      </w:r>
-      <w:r>
-        <w:t xml:space="preserve"> </w:t>
-      </w:r>
-      <w:r>
+        <w:rPr>
+          <w:iCs/>
+          <w:i/>
+        </w:rPr>
+        <w:t xml:space="preserve">[Me]</w:t>
+      </w:r>
+      <w:r>
+        <w:t xml:space="preserve"> </w:t>
+      </w:r>
+      <w:r>
+        <w:rPr>
+          <w:iCs/>
+          <w:i/>
+        </w:rPr>
         <w:t xml:space="preserve">Super! Nou ja, heel fijn dat je wil meedoen sowieso.</w:t>
       </w:r>
     </w:p>
@@ -49,12 +57,20 @@
         <w:pStyle w:val="BlockText"/>
       </w:pPr>
       <w:r>
-        <w:t xml:space="preserve">[Me]</w:t>
-      </w:r>
-      <w:r>
-        <w:t xml:space="preserve"> </w:t>
-      </w:r>
-      <w:r>
+        <w:rPr>
+          <w:iCs/>
+          <w:i/>
+        </w:rPr>
+        <w:t xml:space="preserve">[Me]</w:t>
+      </w:r>
+      <w:r>
+        <w:t xml:space="preserve"> </w:t>
+      </w:r>
+      <w:r>
+        <w:rPr>
+          <w:iCs/>
+          <w:i/>
+        </w:rPr>
         <w:t xml:space="preserve">Ja, goed. Goed, ik, uh, ik, ik zat er diep in, [lacht] moest ik nu, ja. Ik, uh, ik heb even een studievakantie gepakt, dus ik ben, uh, hard bezig met van alles en nog wat om, uh, te zorgen dat het allemaal, uh, lek, lek, lekker doorloopt en werkt. Uhm, want, uh, over twee maanden mag mijn thesis inleveren, de vijftiende. 15 juni. Uh, en er mag nog een boel voor gebeuren de komende tijd. Dus ik, uh, ben lekker aan het worken.</w:t>
       </w:r>
     </w:p>
@@ -77,12 +93,20 @@
         <w:pStyle w:val="BlockText"/>
       </w:pPr>
       <w:r>
-        <w:t xml:space="preserve">[Me]</w:t>
-      </w:r>
-      <w:r>
-        <w:t xml:space="preserve"> </w:t>
-      </w:r>
-      <w:r>
+        <w:rPr>
+          <w:iCs/>
+          <w:i/>
+        </w:rPr>
+        <w:t xml:space="preserve">[Me]</w:t>
+      </w:r>
+      <w:r>
+        <w:t xml:space="preserve"> </w:t>
+      </w:r>
+      <w:r>
+        <w:rPr>
+          <w:iCs/>
+          <w:i/>
+        </w:rPr>
         <w:t xml:space="preserve">Uh, het, het is veel de laatste tijd. Uhm, ik moet wel zeggen ik, ja, ik, ik zit ook een beetje in die rare situatie dat er gewoon echt wel veel gebeurd is op werk de laatste tijd. Uh, vooral ook positieve dingen. Maar, uhm, ja, weet je, je, je bent, uh, we lopen nu met, met mijn team vol budget. Wat heel fijn is, want wat anderzijds ook betekent dat je natuurlijk even andere extra dingen in gang aan het zetten bent.</w:t>
       </w:r>
     </w:p>
@@ -105,12 +129,20 @@
         <w:pStyle w:val="BlockText"/>
       </w:pPr>
       <w:r>
-        <w:t xml:space="preserve">[Me]</w:t>
-      </w:r>
-      <w:r>
-        <w:t xml:space="preserve"> </w:t>
-      </w:r>
-      <w:r>
+        <w:rPr>
+          <w:iCs/>
+          <w:i/>
+        </w:rPr>
+        <w:t xml:space="preserve">[Me]</w:t>
+      </w:r>
+      <w:r>
+        <w:t xml:space="preserve"> </w:t>
+      </w:r>
+      <w:r>
+        <w:rPr>
+          <w:iCs/>
+          <w:i/>
+        </w:rPr>
         <w:t xml:space="preserve">Uhm, maar binnen de groep speelt er ook heel veel, waarbij ik daar op, op AI-gebied wat meer verantwoordelijkheden krijg. Uhm, dus dan, dat zijn allemaal dingen die normaal gesproken je wat overuren opleveren voor een beperkte periode. En dat is toevallig allemaal een beetje in mijn thesisperiode gevallen, dus ik ben nu wat meer vrije aan het nemen om te zorgen dat dat ook even af is. En, uh, heel snel aan het leren om ook nee te zeggen tegen dingen. Dus dat is, [lacht] dat is, dat is soms heel belangrijk.</w:t>
       </w:r>
     </w:p>
@@ -133,12 +165,20 @@
         <w:pStyle w:val="BlockText"/>
       </w:pPr>
       <w:r>
-        <w:t xml:space="preserve">[Me]</w:t>
-      </w:r>
-      <w:r>
-        <w:t xml:space="preserve"> </w:t>
-      </w:r>
-      <w:r>
+        <w:rPr>
+          <w:iCs/>
+          <w:i/>
+        </w:rPr>
+        <w:t xml:space="preserve">[Me]</w:t>
+      </w:r>
+      <w:r>
+        <w:t xml:space="preserve"> </w:t>
+      </w:r>
+      <w:r>
+        <w:rPr>
+          <w:iCs/>
+          <w:i/>
+        </w:rPr>
         <w:t xml:space="preserve">Dus, uh, maar ja, dat gaat in principe goed. Hé, uhm, ik heb ondertussen mijn thesis erbij gepakt. Ik pak even snel m’n, uh, interviewguide, want die moet je toch wel een beetje volgen. Anders wordt mijn begeleider ook boos.</w:t>
       </w:r>
     </w:p>
@@ -161,12 +201,20 @@
         <w:pStyle w:val="BlockText"/>
       </w:pPr>
       <w:r>
-        <w:t xml:space="preserve">[Me]</w:t>
-      </w:r>
-      <w:r>
-        <w:t xml:space="preserve"> </w:t>
-      </w:r>
-      <w:r>
+        <w:rPr>
+          <w:iCs/>
+          <w:i/>
+        </w:rPr>
+        <w:t xml:space="preserve">[Me]</w:t>
+      </w:r>
+      <w:r>
+        <w:t xml:space="preserve"> </w:t>
+      </w:r>
+      <w:r>
+        <w:rPr>
+          <w:iCs/>
+          <w:i/>
+        </w:rPr>
         <w:t xml:space="preserve">Uhm, en dan kunnen we wat mij betreft lekker inhakken. Uhm, ik zit even te denken: mis ik dan nog bepaalde voor dingen? Ik denk het niet. Laten we wat mij, wat mij betreft gewoon een keer induiken en dan, uh, dan komen we er wel uit met elkaar.</w:t>
       </w:r>
     </w:p>
@@ -189,12 +237,20 @@
         <w:pStyle w:val="BlockText"/>
       </w:pPr>
       <w:r>
-        <w:t xml:space="preserve">[Me]</w:t>
-      </w:r>
-      <w:r>
-        <w:t xml:space="preserve"> </w:t>
-      </w:r>
-      <w:r>
+        <w:rPr>
+          <w:iCs/>
+          <w:i/>
+        </w:rPr>
+        <w:t xml:space="preserve">[Me]</w:t>
+      </w:r>
+      <w:r>
+        <w:t xml:space="preserve"> </w:t>
+      </w:r>
+      <w:r>
+        <w:rPr>
+          <w:iCs/>
+          <w:i/>
+        </w:rPr>
         <w:t xml:space="preserve">Hé, uhm, vind je het trouwens goed om het in het Engels doen?</w:t>
       </w:r>
     </w:p>
@@ -217,12 +273,20 @@
         <w:pStyle w:val="BlockText"/>
       </w:pPr>
       <w:r>
-        <w:t xml:space="preserve">[Me]</w:t>
-      </w:r>
-      <w:r>
-        <w:t xml:space="preserve"> </w:t>
-      </w:r>
-      <w:r>
+        <w:rPr>
+          <w:iCs/>
+          <w:i/>
+        </w:rPr>
+        <w:t xml:space="preserve">[Me]</w:t>
+      </w:r>
+      <w:r>
+        <w:t xml:space="preserve"> </w:t>
+      </w:r>
+      <w:r>
+        <w:rPr>
+          <w:iCs/>
+          <w:i/>
+        </w:rPr>
         <w:t xml:space="preserve">Cool. Oké, that, that helps me a lot, because otherwise I have to translate everything.</w:t>
       </w:r>
     </w:p>
@@ -245,12 +309,20 @@
         <w:pStyle w:val="BlockText"/>
       </w:pPr>
       <w:r>
-        <w:t xml:space="preserve">[Me]</w:t>
-      </w:r>
-      <w:r>
-        <w:t xml:space="preserve"> </w:t>
-      </w:r>
-      <w:r>
+        <w:rPr>
+          <w:iCs/>
+          <w:i/>
+        </w:rPr>
+        <w:t xml:space="preserve">[Me]</w:t>
+      </w:r>
+      <w:r>
+        <w:t xml:space="preserve"> </w:t>
+      </w:r>
+      <w:r>
+        <w:rPr>
+          <w:iCs/>
+          <w:i/>
+        </w:rPr>
         <w:t xml:space="preserve">Uh, and if it’s not going smoothly or you feel conflicted, I’ll still translate and we can always go back. So-</w:t>
       </w:r>
     </w:p>
@@ -273,12 +345,20 @@
         <w:pStyle w:val="BlockText"/>
       </w:pPr>
       <w:r>
-        <w:t xml:space="preserve">[Me]</w:t>
-      </w:r>
-      <w:r>
-        <w:t xml:space="preserve"> </w:t>
-      </w:r>
-      <w:r>
+        <w:rPr>
+          <w:iCs/>
+          <w:i/>
+        </w:rPr>
+        <w:t xml:space="preserve">[Me]</w:t>
+      </w:r>
+      <w:r>
+        <w:t xml:space="preserve"> </w:t>
+      </w:r>
+      <w:r>
+        <w:rPr>
+          <w:iCs/>
+          <w:i/>
+        </w:rPr>
         <w:t xml:space="preserve">…let, let’s start with just the basics, just for recording purposes. So, can you briefly just describe your role within the organization, what you’re doing, and how that impacts AI and marketing and what we’re talking about?</w:t>
       </w:r>
     </w:p>
@@ -301,12 +381,20 @@
         <w:pStyle w:val="BlockText"/>
       </w:pPr>
       <w:r>
-        <w:t xml:space="preserve">[Me]</w:t>
-      </w:r>
-      <w:r>
-        <w:t xml:space="preserve"> </w:t>
-      </w:r>
-      <w:r>
+        <w:rPr>
+          <w:iCs/>
+          <w:i/>
+        </w:rPr>
+        <w:t xml:space="preserve">[Me]</w:t>
+      </w:r>
+      <w:r>
+        <w:t xml:space="preserve"> </w:t>
+      </w:r>
+      <w:r>
+        <w:rPr>
+          <w:iCs/>
+          <w:i/>
+        </w:rPr>
         <w:t xml:space="preserve">Yeah, so I think you might have the most, um, badly defined, uh, job title [lacht] in the history of mankind.</w:t>
       </w:r>
     </w:p>
@@ -329,12 +417,20 @@
         <w:pStyle w:val="BlockText"/>
       </w:pPr>
       <w:r>
-        <w:t xml:space="preserve">[Me]</w:t>
-      </w:r>
-      <w:r>
-        <w:t xml:space="preserve"> </w:t>
-      </w:r>
-      <w:r>
+        <w:rPr>
+          <w:iCs/>
+          <w:i/>
+        </w:rPr>
+        <w:t xml:space="preserve">[Me]</w:t>
+      </w:r>
+      <w:r>
+        <w:t xml:space="preserve"> </w:t>
+      </w:r>
+      <w:r>
+        <w:rPr>
+          <w:iCs/>
+          <w:i/>
+        </w:rPr>
         <w:t xml:space="preserve">You essentially are a change manager and a product manager. And, uh, you also do something with data, but you’re named, uh, data analyst. [lacht]</w:t>
       </w:r>
     </w:p>
@@ -357,12 +453,20 @@
         <w:pStyle w:val="BlockText"/>
       </w:pPr>
       <w:r>
-        <w:t xml:space="preserve">[Me]</w:t>
-      </w:r>
-      <w:r>
-        <w:t xml:space="preserve"> </w:t>
-      </w:r>
-      <w:r>
+        <w:rPr>
+          <w:iCs/>
+          <w:i/>
+        </w:rPr>
+        <w:t xml:space="preserve">[Me]</w:t>
+      </w:r>
+      <w:r>
+        <w:t xml:space="preserve"> </w:t>
+      </w:r>
+      <w:r>
+        <w:rPr>
+          <w:iCs/>
+          <w:i/>
+        </w:rPr>
         <w:t xml:space="preserve">Check. So also just basically to establish a common ground. So what does generative AI mean for you?</w:t>
       </w:r>
     </w:p>
@@ -385,12 +489,20 @@
         <w:pStyle w:val="BlockText"/>
       </w:pPr>
       <w:r>
-        <w:t xml:space="preserve">[Me]</w:t>
-      </w:r>
-      <w:r>
-        <w:t xml:space="preserve"> </w:t>
-      </w:r>
-      <w:r>
+        <w:rPr>
+          <w:iCs/>
+          <w:i/>
+        </w:rPr>
+        <w:t xml:space="preserve">[Me]</w:t>
+      </w:r>
+      <w:r>
+        <w:t xml:space="preserve"> </w:t>
+      </w:r>
+      <w:r>
+        <w:rPr>
+          <w:iCs/>
+          <w:i/>
+        </w:rPr>
         <w:t xml:space="preserve">And so how does that differ from agentic AI?</w:t>
       </w:r>
     </w:p>
@@ -413,12 +525,20 @@
         <w:pStyle w:val="BlockText"/>
       </w:pPr>
       <w:r>
-        <w:t xml:space="preserve">[Me]</w:t>
-      </w:r>
-      <w:r>
-        <w:t xml:space="preserve"> </w:t>
-      </w:r>
-      <w:r>
+        <w:rPr>
+          <w:iCs/>
+          <w:i/>
+        </w:rPr>
+        <w:t xml:space="preserve">[Me]</w:t>
+      </w:r>
+      <w:r>
+        <w:t xml:space="preserve"> </w:t>
+      </w:r>
+      <w:r>
+        <w:rPr>
+          <w:iCs/>
+          <w:i/>
+        </w:rPr>
         <w:t xml:space="preserve">Yeah. So I, I agree. And I think that boundary is kind of tough to make. Uh, on the other hand, I want to scope my research a bit and not only focus it on generating content, because that is something that has been written about a lot. So if that’s like my, my thesis question is how can agentic AI help marketing managers to create value, right. So very broad. Um, but then you have to scope agentic AI. And while there are many definitions in literature, I focus on two critical aspects, and that is, one, it has some capability to plan.Uh, so it, you can give it an instruction, and it’ll figure out what you actually mean and execute on it. And then that’s the second part, like, can actually execute. So that can mean, uh, RAG, like getting information from a data system using queries. Uh, but it can definitely also mean, like, acting as systems to ensure, like, the, the user or the customer has a different experience to get something done. Like, to me-</w:t>
       </w:r>
     </w:p>
@@ -441,12 +561,20 @@
         <w:pStyle w:val="BlockText"/>
       </w:pPr>
       <w:r>
-        <w:t xml:space="preserve">[Me]</w:t>
-      </w:r>
-      <w:r>
-        <w:t xml:space="preserve"> </w:t>
-      </w:r>
-      <w:r>
+        <w:rPr>
+          <w:iCs/>
+          <w:i/>
+        </w:rPr>
+        <w:t xml:space="preserve">[Me]</w:t>
+      </w:r>
+      <w:r>
+        <w:t xml:space="preserve"> </w:t>
+      </w:r>
+      <w:r>
+        <w:rPr>
+          <w:iCs/>
+          <w:i/>
+        </w:rPr>
         <w:t xml:space="preserve">… that those are the, the … It’s like the boundaries of what we are talking about. So now for the fun bit, let’s talk a little bit about use cases. So how are you using generative AI in your organization, if at all?</w:t>
       </w:r>
     </w:p>
@@ -469,12 +597,20 @@
         <w:pStyle w:val="BlockText"/>
       </w:pPr>
       <w:r>
-        <w:t xml:space="preserve">[Me]</w:t>
-      </w:r>
-      <w:r>
-        <w:t xml:space="preserve"> </w:t>
-      </w:r>
-      <w:r>
+        <w:rPr>
+          <w:iCs/>
+          <w:i/>
+        </w:rPr>
+        <w:t xml:space="preserve">[Me]</w:t>
+      </w:r>
+      <w:r>
+        <w:t xml:space="preserve"> </w:t>
+      </w:r>
+      <w:r>
+        <w:rPr>
+          <w:iCs/>
+          <w:i/>
+        </w:rPr>
         <w:t xml:space="preserve">Like a, like a leaflet.</w:t>
       </w:r>
     </w:p>
@@ -497,12 +633,20 @@
         <w:pStyle w:val="BlockText"/>
       </w:pPr>
       <w:r>
-        <w:t xml:space="preserve">[Me]</w:t>
-      </w:r>
-      <w:r>
-        <w:t xml:space="preserve"> </w:t>
-      </w:r>
-      <w:r>
+        <w:rPr>
+          <w:iCs/>
+          <w:i/>
+        </w:rPr>
+        <w:t xml:space="preserve">[Me]</w:t>
+      </w:r>
+      <w:r>
+        <w:t xml:space="preserve"> </w:t>
+      </w:r>
+      <w:r>
+        <w:rPr>
+          <w:iCs/>
+          <w:i/>
+        </w:rPr>
         <w:t xml:space="preserve">[laughs] It’s a big leaflet.</w:t>
       </w:r>
     </w:p>
@@ -525,12 +669,20 @@
         <w:pStyle w:val="BlockText"/>
       </w:pPr>
       <w:r>
-        <w:t xml:space="preserve">[Me]</w:t>
-      </w:r>
-      <w:r>
-        <w:t xml:space="preserve"> </w:t>
-      </w:r>
-      <w:r>
+        <w:rPr>
+          <w:iCs/>
+          <w:i/>
+        </w:rPr>
+        <w:t xml:space="preserve">[Me]</w:t>
+      </w:r>
+      <w:r>
+        <w:t xml:space="preserve"> </w:t>
+      </w:r>
+      <w:r>
+        <w:rPr>
+          <w:iCs/>
+          <w:i/>
+        </w:rPr>
         <w:t xml:space="preserve">The whole A to Z, yeah</w:t>
       </w:r>
     </w:p>
@@ -553,12 +705,20 @@
         <w:pStyle w:val="BlockText"/>
       </w:pPr>
       <w:r>
-        <w:t xml:space="preserve">[Me]</w:t>
-      </w:r>
-      <w:r>
-        <w:t xml:space="preserve"> </w:t>
-      </w:r>
-      <w:r>
+        <w:rPr>
+          <w:iCs/>
+          <w:i/>
+        </w:rPr>
+        <w:t xml:space="preserve">[Me]</w:t>
+      </w:r>
+      <w:r>
+        <w:t xml:space="preserve"> </w:t>
+      </w:r>
+      <w:r>
+        <w:rPr>
+          <w:iCs/>
+          <w:i/>
+        </w:rPr>
         <w:t xml:space="preserve">Interesting. And so I, I obviously know a little bit about everything that you talked about because we-</w:t>
       </w:r>
     </w:p>
@@ -581,12 +741,20 @@
         <w:pStyle w:val="BlockText"/>
       </w:pPr>
       <w:r>
-        <w:t xml:space="preserve">[Me]</w:t>
-      </w:r>
-      <w:r>
-        <w:t xml:space="preserve"> </w:t>
-      </w:r>
-      <w:r>
+        <w:rPr>
+          <w:iCs/>
+          <w:i/>
+        </w:rPr>
+        <w:t xml:space="preserve">[Me]</w:t>
+      </w:r>
+      <w:r>
+        <w:t xml:space="preserve"> </w:t>
+      </w:r>
+      <w:r>
+        <w:rPr>
+          <w:iCs/>
+          <w:i/>
+        </w:rPr>
         <w:t xml:space="preserve">… worked together on some of these projects. Um, but you, you were talking about 80 to 90 routes now. I know you have had a script that creates those routes. I- is h- what percentage of those routes is AI generated versus manual, uh, it already existed, or we … How, how does it work now?</w:t>
       </w:r>
     </w:p>
@@ -609,19 +777,49 @@
         <w:pStyle w:val="BlockText"/>
       </w:pPr>
       <w:r>
-        <w:t xml:space="preserve">[Me]</w:t>
-      </w:r>
-      <w:r>
-        <w:t xml:space="preserve"> </w:t>
-      </w:r>
-      <w:r>
+        <w:rPr>
+          <w:iCs/>
+          <w:i/>
+        </w:rPr>
+        <w:t xml:space="preserve">[Me]</w:t>
+      </w:r>
+      <w:r>
+        <w:t xml:space="preserve"> </w:t>
+      </w:r>
+      <w:r>
+        <w:rPr>
+          <w:iCs/>
+          <w:i/>
+        </w:rPr>
         <w:t xml:space="preserve">So that is something that is not typically associated with, uh… It’s not the campaigning part of marketing, but it’s interesting that you saw a customer need here and thought like,</w:t>
       </w:r>
       <w:r>
-        <w:t xml:space="preserve"> </w:t>
-      </w:r>
-      <w:r>
-        <w:t xml:space="preserve">“Hey, we can do something very different using AI.”</w:t>
+        <w:rPr>
+          <w:iCs/>
+          <w:i/>
+        </w:rPr>
+        <w:t xml:space="preserve"> </w:t>
+      </w:r>
+      <w:r>
+        <w:rPr>
+          <w:iCs/>
+          <w:i/>
+        </w:rPr>
+        <w:t xml:space="preserve">“</w:t>
+      </w:r>
+      <w:r>
+        <w:rPr>
+          <w:iCs/>
+          <w:i/>
+        </w:rPr>
+        <w:t xml:space="preserve">Hey, we can do something very different using AI.</w:t>
+      </w:r>
+      <w:r>
+        <w:rPr>
+          <w:iCs/>
+          <w:i/>
+        </w:rPr>
+        <w:t xml:space="preserve">”</w:t>
       </w:r>
     </w:p>
     <w:p>
@@ -643,12 +841,20 @@
         <w:pStyle w:val="BlockText"/>
       </w:pPr>
       <w:r>
-        <w:t xml:space="preserve">[Me]</w:t>
-      </w:r>
-      <w:r>
-        <w:t xml:space="preserve"> </w:t>
-      </w:r>
-      <w:r>
+        <w:rPr>
+          <w:iCs/>
+          <w:i/>
+        </w:rPr>
+        <w:t xml:space="preserve">[Me]</w:t>
+      </w:r>
+      <w:r>
+        <w:t xml:space="preserve"> </w:t>
+      </w:r>
+      <w:r>
+        <w:rPr>
+          <w:iCs/>
+          <w:i/>
+        </w:rPr>
         <w:t xml:space="preserve">But you, you already were doing that for all of the routes, and you just saved three working days almost. So I, I don’t know how long it takes now. Uh-</w:t>
       </w:r>
     </w:p>
@@ -671,12 +877,20 @@
         <w:pStyle w:val="BlockText"/>
       </w:pPr>
       <w:r>
-        <w:t xml:space="preserve">[Me]</w:t>
-      </w:r>
-      <w:r>
-        <w:t xml:space="preserve"> </w:t>
-      </w:r>
-      <w:r>
+        <w:rPr>
+          <w:iCs/>
+          <w:i/>
+        </w:rPr>
+        <w:t xml:space="preserve">[Me]</w:t>
+      </w:r>
+      <w:r>
+        <w:t xml:space="preserve"> </w:t>
+      </w:r>
+      <w:r>
+        <w:rPr>
+          <w:iCs/>
+          <w:i/>
+        </w:rPr>
         <w:t xml:space="preserve">… maybe we can guesstimate.</w:t>
       </w:r>
     </w:p>
@@ -699,12 +913,20 @@
         <w:pStyle w:val="BlockText"/>
       </w:pPr>
       <w:r>
-        <w:t xml:space="preserve">[Me]</w:t>
-      </w:r>
-      <w:r>
-        <w:t xml:space="preserve"> </w:t>
-      </w:r>
-      <w:r>
+        <w:rPr>
+          <w:iCs/>
+          <w:i/>
+        </w:rPr>
+        <w:t xml:space="preserve">[Me]</w:t>
+      </w:r>
+      <w:r>
+        <w:t xml:space="preserve"> </w:t>
+      </w:r>
+      <w:r>
+        <w:rPr>
+          <w:iCs/>
+          <w:i/>
+        </w:rPr>
         <w:t xml:space="preserve">So that’s a big, big business case there-</w:t>
       </w:r>
     </w:p>
@@ -727,12 +949,20 @@
         <w:pStyle w:val="BlockText"/>
       </w:pPr>
       <w:r>
-        <w:t xml:space="preserve">[Me]</w:t>
-      </w:r>
-      <w:r>
-        <w:t xml:space="preserve"> </w:t>
-      </w:r>
-      <w:r>
+        <w:rPr>
+          <w:iCs/>
+          <w:i/>
+        </w:rPr>
+        <w:t xml:space="preserve">[Me]</w:t>
+      </w:r>
+      <w:r>
+        <w:t xml:space="preserve"> </w:t>
+      </w:r>
+      <w:r>
+        <w:rPr>
+          <w:iCs/>
+          <w:i/>
+        </w:rPr>
         <w:t xml:space="preserve">… where you, where you-</w:t>
       </w:r>
     </w:p>
@@ -755,12 +985,20 @@
         <w:pStyle w:val="BlockText"/>
       </w:pPr>
       <w:r>
-        <w:t xml:space="preserve">[Me]</w:t>
-      </w:r>
-      <w:r>
-        <w:t xml:space="preserve"> </w:t>
-      </w:r>
-      <w:r>
+        <w:rPr>
+          <w:iCs/>
+          <w:i/>
+        </w:rPr>
+        <w:t xml:space="preserve">[Me]</w:t>
+      </w:r>
+      <w:r>
+        <w:t xml:space="preserve"> </w:t>
+      </w:r>
+      <w:r>
+        <w:rPr>
+          <w:iCs/>
+          <w:i/>
+        </w:rPr>
         <w:t xml:space="preserve">… look at it from a time savings perspective.</w:t>
       </w:r>
     </w:p>
@@ -783,12 +1021,20 @@
         <w:pStyle w:val="BlockText"/>
       </w:pPr>
       <w:r>
-        <w:t xml:space="preserve">[Me]</w:t>
-      </w:r>
-      <w:r>
-        <w:t xml:space="preserve"> </w:t>
-      </w:r>
-      <w:r>
+        <w:rPr>
+          <w:iCs/>
+          <w:i/>
+        </w:rPr>
+        <w:t xml:space="preserve">[Me]</w:t>
+      </w:r>
+      <w:r>
+        <w:t xml:space="preserve"> </w:t>
+      </w:r>
+      <w:r>
+        <w:rPr>
+          <w:iCs/>
+          <w:i/>
+        </w:rPr>
         <w:t xml:space="preserve">Do you then see that you do a lot more as well because of this?</w:t>
       </w:r>
     </w:p>
@@ -811,12 +1057,20 @@
         <w:pStyle w:val="BlockText"/>
       </w:pPr>
       <w:r>
-        <w:t xml:space="preserve">[Me]</w:t>
-      </w:r>
-      <w:r>
-        <w:t xml:space="preserve"> </w:t>
-      </w:r>
-      <w:r>
+        <w:rPr>
+          <w:iCs/>
+          <w:i/>
+        </w:rPr>
+        <w:t xml:space="preserve">[Me]</w:t>
+      </w:r>
+      <w:r>
+        <w:t xml:space="preserve"> </w:t>
+      </w:r>
+      <w:r>
+        <w:rPr>
+          <w:iCs/>
+          <w:i/>
+        </w:rPr>
         <w:t xml:space="preserve">So to be converted into being a member?</w:t>
       </w:r>
     </w:p>
@@ -837,7 +1091,13 @@
         <w:t xml:space="preserve"> </w:t>
       </w:r>
       <w:r>
-        <w:t xml:space="preserve">“Okay, now I’m gonna go to that area because NKC told me about it.”</w:t>
+        <w:t xml:space="preserve">“</w:t>
+      </w:r>
+      <w:r>
+        <w:t xml:space="preserve">Okay, now I’m gonna go to that area because NKC told me about it.</w:t>
+      </w:r>
+      <w:r>
+        <w:t xml:space="preserve">”</w:t>
       </w:r>
       <w:r>
         <w:t xml:space="preserve"> </w:t>
@@ -851,12 +1111,20 @@
         <w:pStyle w:val="BlockText"/>
       </w:pPr>
       <w:r>
-        <w:t xml:space="preserve">[Me]</w:t>
-      </w:r>
-      <w:r>
-        <w:t xml:space="preserve"> </w:t>
-      </w:r>
-      <w:r>
+        <w:rPr>
+          <w:iCs/>
+          <w:i/>
+        </w:rPr>
+        <w:t xml:space="preserve">[Me]</w:t>
+      </w:r>
+      <w:r>
+        <w:t xml:space="preserve"> </w:t>
+      </w:r>
+      <w:r>
+        <w:rPr>
+          <w:iCs/>
+          <w:i/>
+        </w:rPr>
         <w:t xml:space="preserve">Mm. So you’re thinking about how you can lever- leverage the AI to make it better across the board?</w:t>
       </w:r>
     </w:p>
@@ -879,12 +1147,20 @@
         <w:pStyle w:val="BlockText"/>
       </w:pPr>
       <w:r>
-        <w:t xml:space="preserve">[Me]</w:t>
-      </w:r>
-      <w:r>
-        <w:t xml:space="preserve"> </w:t>
-      </w:r>
-      <w:r>
+        <w:rPr>
+          <w:iCs/>
+          <w:i/>
+        </w:rPr>
+        <w:t xml:space="preserve">[Me]</w:t>
+      </w:r>
+      <w:r>
+        <w:t xml:space="preserve"> </w:t>
+      </w:r>
+      <w:r>
+        <w:rPr>
+          <w:iCs/>
+          <w:i/>
+        </w:rPr>
         <w:t xml:space="preserve">How does it work for you?</w:t>
       </w:r>
     </w:p>
@@ -907,12 +1183,20 @@
         <w:pStyle w:val="BlockText"/>
       </w:pPr>
       <w:r>
-        <w:t xml:space="preserve">[Me]</w:t>
-      </w:r>
-      <w:r>
-        <w:t xml:space="preserve"> </w:t>
-      </w:r>
-      <w:r>
+        <w:rPr>
+          <w:iCs/>
+          <w:i/>
+        </w:rPr>
+        <w:t xml:space="preserve">[Me]</w:t>
+      </w:r>
+      <w:r>
+        <w:t xml:space="preserve"> </w:t>
+      </w:r>
+      <w:r>
+        <w:rPr>
+          <w:iCs/>
+          <w:i/>
+        </w:rPr>
         <w:t xml:space="preserve">And so h- how is the AI the solution here? In the sense it’s-</w:t>
       </w:r>
     </w:p>
@@ -935,12 +1219,20 @@
         <w:pStyle w:val="BlockText"/>
       </w:pPr>
       <w:r>
-        <w:t xml:space="preserve">[Me]</w:t>
-      </w:r>
-      <w:r>
-        <w:t xml:space="preserve"> </w:t>
-      </w:r>
-      <w:r>
+        <w:rPr>
+          <w:iCs/>
+          <w:i/>
+        </w:rPr>
+        <w:t xml:space="preserve">[Me]</w:t>
+      </w:r>
+      <w:r>
+        <w:t xml:space="preserve"> </w:t>
+      </w:r>
+      <w:r>
+        <w:rPr>
+          <w:iCs/>
+          <w:i/>
+        </w:rPr>
         <w:t xml:space="preserve">… I think that’s, that’s the question, right? So how are you leveraging AI to make it better? Uh-</w:t>
       </w:r>
     </w:p>
@@ -963,12 +1255,20 @@
         <w:pStyle w:val="BlockText"/>
       </w:pPr>
       <w:r>
-        <w:t xml:space="preserve">[Me]</w:t>
-      </w:r>
-      <w:r>
-        <w:t xml:space="preserve"> </w:t>
-      </w:r>
-      <w:r>
+        <w:rPr>
+          <w:iCs/>
+          <w:i/>
+        </w:rPr>
+        <w:t xml:space="preserve">[Me]</w:t>
+      </w:r>
+      <w:r>
+        <w:t xml:space="preserve"> </w:t>
+      </w:r>
+      <w:r>
+        <w:rPr>
+          <w:iCs/>
+          <w:i/>
+        </w:rPr>
         <w:t xml:space="preserve">… yes, I think finding focus is hard, but…</w:t>
       </w:r>
     </w:p>
@@ -989,7 +1289,13 @@
         <w:t xml:space="preserve"> </w:t>
       </w:r>
       <w:r>
-        <w:t xml:space="preserve">“Well, next sprint we can pick it up,”</w:t>
+        <w:t xml:space="preserve">“</w:t>
+      </w:r>
+      <w:r>
+        <w:t xml:space="preserve">Well, next sprint we can pick it up,</w:t>
+      </w:r>
+      <w:r>
+        <w:t xml:space="preserve">”</w:t>
       </w:r>
       <w:r>
         <w:t xml:space="preserve"> </w:t>
@@ -1003,12 +1309,20 @@
         <w:pStyle w:val="BlockText"/>
       </w:pPr>
       <w:r>
-        <w:t xml:space="preserve">[Me]</w:t>
-      </w:r>
-      <w:r>
-        <w:t xml:space="preserve"> </w:t>
-      </w:r>
-      <w:r>
+        <w:rPr>
+          <w:iCs/>
+          <w:i/>
+        </w:rPr>
+        <w:t xml:space="preserve">[Me]</w:t>
+      </w:r>
+      <w:r>
+        <w:t xml:space="preserve"> </w:t>
+      </w:r>
+      <w:r>
+        <w:rPr>
+          <w:iCs/>
+          <w:i/>
+        </w:rPr>
         <w:t xml:space="preserve">Cool. So it sounded before like you were almost going to say, in addition to this, that it also helps to essentially ground what you are doing because you, when you apply AI to something, you have a process which you can improve and then have better content. Is that a, you know, important aspect of the strategy, or is it not really something that you’re thinking about?</w:t>
       </w:r>
     </w:p>
@@ -1031,12 +1345,20 @@
         <w:pStyle w:val="BlockText"/>
       </w:pPr>
       <w:r>
-        <w:t xml:space="preserve">[Me]</w:t>
-      </w:r>
-      <w:r>
-        <w:t xml:space="preserve"> </w:t>
-      </w:r>
-      <w:r>
+        <w:rPr>
+          <w:iCs/>
+          <w:i/>
+        </w:rPr>
+        <w:t xml:space="preserve">[Me]</w:t>
+      </w:r>
+      <w:r>
+        <w:t xml:space="preserve"> </w:t>
+      </w:r>
+      <w:r>
+        <w:rPr>
+          <w:iCs/>
+          <w:i/>
+        </w:rPr>
         <w:t xml:space="preserve">So when you create 80 or 90 routes with AI and you’re thinking about what is important to you-</w:t>
       </w:r>
     </w:p>
@@ -1059,12 +1381,20 @@
         <w:pStyle w:val="BlockText"/>
       </w:pPr>
       <w:r>
-        <w:t xml:space="preserve">[Me]</w:t>
-      </w:r>
-      <w:r>
-        <w:t xml:space="preserve"> </w:t>
-      </w:r>
-      <w:r>
+        <w:rPr>
+          <w:iCs/>
+          <w:i/>
+        </w:rPr>
+        <w:t xml:space="preserve">[Me]</w:t>
+      </w:r>
+      <w:r>
+        <w:t xml:space="preserve"> </w:t>
+      </w:r>
+      <w:r>
+        <w:rPr>
+          <w:iCs/>
+          <w:i/>
+        </w:rPr>
         <w:t xml:space="preserve">… uh, you suddenly indeed have something to create those routes really rapidly. Essentially, it’s, it’s becoming almost free to create those 80 routes.</w:t>
       </w:r>
     </w:p>
@@ -1087,12 +1417,20 @@
         <w:pStyle w:val="BlockText"/>
       </w:pPr>
       <w:r>
-        <w:t xml:space="preserve">[Me]</w:t>
-      </w:r>
-      <w:r>
-        <w:t xml:space="preserve"> </w:t>
-      </w:r>
-      <w:r>
+        <w:rPr>
+          <w:iCs/>
+          <w:i/>
+        </w:rPr>
+        <w:t xml:space="preserve">[Me]</w:t>
+      </w:r>
+      <w:r>
+        <w:t xml:space="preserve"> </w:t>
+      </w:r>
+      <w:r>
+        <w:rPr>
+          <w:iCs/>
+          <w:i/>
+        </w:rPr>
         <w:t xml:space="preserve">Um, that also means that you have much more freedom to iterate, right? You can just-</w:t>
       </w:r>
     </w:p>
@@ -1115,12 +1453,20 @@
         <w:pStyle w:val="BlockText"/>
       </w:pPr>
       <w:r>
-        <w:t xml:space="preserve">[Me]</w:t>
-      </w:r>
-      <w:r>
-        <w:t xml:space="preserve"> </w:t>
-      </w:r>
-      <w:r>
+        <w:rPr>
+          <w:iCs/>
+          <w:i/>
+        </w:rPr>
+        <w:t xml:space="preserve">[Me]</w:t>
+      </w:r>
+      <w:r>
+        <w:t xml:space="preserve"> </w:t>
+      </w:r>
+      <w:r>
+        <w:rPr>
+          <w:iCs/>
+          <w:i/>
+        </w:rPr>
         <w:t xml:space="preserve">… change what is important to you, rerun the script, and suddenly you have-</w:t>
       </w:r>
     </w:p>
@@ -1143,12 +1489,20 @@
         <w:pStyle w:val="BlockText"/>
       </w:pPr>
       <w:r>
-        <w:t xml:space="preserve">[Me]</w:t>
-      </w:r>
-      <w:r>
-        <w:t xml:space="preserve"> </w:t>
-      </w:r>
-      <w:r>
+        <w:rPr>
+          <w:iCs/>
+          <w:i/>
+        </w:rPr>
+        <w:t xml:space="preserve">[Me]</w:t>
+      </w:r>
+      <w:r>
+        <w:t xml:space="preserve"> </w:t>
+      </w:r>
+      <w:r>
+        <w:rPr>
+          <w:iCs/>
+          <w:i/>
+        </w:rPr>
         <w:t xml:space="preserve">… 80 or 90 updated routes.</w:t>
       </w:r>
     </w:p>
@@ -1171,12 +1525,20 @@
         <w:pStyle w:val="BlockText"/>
       </w:pPr>
       <w:r>
-        <w:t xml:space="preserve">[Me]</w:t>
-      </w:r>
-      <w:r>
-        <w:t xml:space="preserve"> </w:t>
-      </w:r>
-      <w:r>
+        <w:rPr>
+          <w:iCs/>
+          <w:i/>
+        </w:rPr>
+        <w:t xml:space="preserve">[Me]</w:t>
+      </w:r>
+      <w:r>
+        <w:t xml:space="preserve"> </w:t>
+      </w:r>
+      <w:r>
+        <w:rPr>
+          <w:iCs/>
+          <w:i/>
+        </w:rPr>
         <w:t xml:space="preserve">… how important is that to you?</w:t>
       </w:r>
     </w:p>
@@ -1197,7 +1559,13 @@
         <w:t xml:space="preserve"> </w:t>
       </w:r>
       <w:r>
-        <w:t xml:space="preserve">“Well, let’s just try this now,”</w:t>
+        <w:t xml:space="preserve">“</w:t>
+      </w:r>
+      <w:r>
+        <w:t xml:space="preserve">Well, let’s just try this now,</w:t>
+      </w:r>
+      <w:r>
+        <w:t xml:space="preserve">”</w:t>
       </w:r>
       <w:r>
         <w:t xml:space="preserve"> </w:t>
@@ -1209,7 +1577,13 @@
         <w:t xml:space="preserve"> </w:t>
       </w:r>
       <w:r>
-        <w:t xml:space="preserve">“Try that,”</w:t>
+        <w:t xml:space="preserve">“</w:t>
+      </w:r>
+      <w:r>
+        <w:t xml:space="preserve">Try that,</w:t>
+      </w:r>
+      <w:r>
+        <w:t xml:space="preserve">”</w:t>
       </w:r>
       <w:r>
         <w:t xml:space="preserve"> </w:t>
@@ -1221,7 +1595,13 @@
         <w:t xml:space="preserve"> </w:t>
       </w:r>
       <w:r>
-        <w:t xml:space="preserve">“What, what does it look like if we change this and then apply it over all these routes?”</w:t>
+        <w:t xml:space="preserve">“</w:t>
+      </w:r>
+      <w:r>
+        <w:t xml:space="preserve">What, what does it look like if we change this and then apply it over all these routes?</w:t>
+      </w:r>
+      <w:r>
+        <w:t xml:space="preserve">”</w:t>
       </w:r>
       <w:r>
         <w:t xml:space="preserve"> </w:t>
@@ -1235,12 +1615,20 @@
         <w:pStyle w:val="BlockText"/>
       </w:pPr>
       <w:r>
-        <w:t xml:space="preserve">[Me]</w:t>
-      </w:r>
-      <w:r>
-        <w:t xml:space="preserve"> </w:t>
-      </w:r>
-      <w:r>
+        <w:rPr>
+          <w:iCs/>
+          <w:i/>
+        </w:rPr>
+        <w:t xml:space="preserve">[Me]</w:t>
+      </w:r>
+      <w:r>
+        <w:t xml:space="preserve"> </w:t>
+      </w:r>
+      <w:r>
+        <w:rPr>
+          <w:iCs/>
+          <w:i/>
+        </w:rPr>
         <w:t xml:space="preserve">That’s interesting. I, I haven’t, uh, heard anybody explain it like this before in my, uh, experience-</w:t>
       </w:r>
     </w:p>
@@ -1263,12 +1651,20 @@
         <w:pStyle w:val="BlockText"/>
       </w:pPr>
       <w:r>
-        <w:t xml:space="preserve">[Me]</w:t>
-      </w:r>
-      <w:r>
-        <w:t xml:space="preserve"> </w:t>
-      </w:r>
-      <w:r>
+        <w:rPr>
+          <w:iCs/>
+          <w:i/>
+        </w:rPr>
+        <w:t xml:space="preserve">[Me]</w:t>
+      </w:r>
+      <w:r>
+        <w:t xml:space="preserve"> </w:t>
+      </w:r>
+      <w:r>
+        <w:rPr>
+          <w:iCs/>
+          <w:i/>
+        </w:rPr>
         <w:t xml:space="preserve">… so that’s, that’s always good [laughs] to, like, actually get new information. So you also talked a little bit about how fast everything is going. Does it mean that you are vibe coding a lot yourself, or are you doing, like, agentic engineering, or, uh …</w:t>
       </w:r>
     </w:p>
@@ -1289,7 +1685,13 @@
         <w:t xml:space="preserve"> </w:t>
       </w:r>
       <w:r>
-        <w:t xml:space="preserve">“Ah, now I have an app.”</w:t>
+        <w:t xml:space="preserve">“</w:t>
+      </w:r>
+      <w:r>
+        <w:t xml:space="preserve">Ah, now I have an app.</w:t>
+      </w:r>
+      <w:r>
+        <w:t xml:space="preserve">”</w:t>
       </w:r>
       <w:r>
         <w:t xml:space="preserve"> </w:t>
@@ -1303,12 +1705,20 @@
         <w:pStyle w:val="BlockText"/>
       </w:pPr>
       <w:r>
-        <w:t xml:space="preserve">[Me]</w:t>
-      </w:r>
-      <w:r>
-        <w:t xml:space="preserve"> </w:t>
-      </w:r>
-      <w:r>
+        <w:rPr>
+          <w:iCs/>
+          <w:i/>
+        </w:rPr>
+        <w:t xml:space="preserve">[Me]</w:t>
+      </w:r>
+      <w:r>
+        <w:t xml:space="preserve"> </w:t>
+      </w:r>
+      <w:r>
+        <w:rPr>
+          <w:iCs/>
+          <w:i/>
+        </w:rPr>
         <w:t xml:space="preserve">So how does that work for you guys with the, the back end part needs needing to be really robust, but if you’re making something like a app, you’re also needing like new back end systems, right? To support it all.</w:t>
       </w:r>
     </w:p>
@@ -1331,12 +1741,20 @@
         <w:pStyle w:val="BlockText"/>
       </w:pPr>
       <w:r>
-        <w:t xml:space="preserve">[Me]</w:t>
-      </w:r>
-      <w:r>
-        <w:t xml:space="preserve"> </w:t>
-      </w:r>
-      <w:r>
+        <w:rPr>
+          <w:iCs/>
+          <w:i/>
+        </w:rPr>
+        <w:t xml:space="preserve">[Me]</w:t>
+      </w:r>
+      <w:r>
+        <w:t xml:space="preserve"> </w:t>
+      </w:r>
+      <w:r>
+        <w:rPr>
+          <w:iCs/>
+          <w:i/>
+        </w:rPr>
         <w:t xml:space="preserve">So you essentially make like a risk analysis for yourself and then see like-</w:t>
       </w:r>
     </w:p>
@@ -1359,12 +1777,20 @@
         <w:pStyle w:val="BlockText"/>
       </w:pPr>
       <w:r>
-        <w:t xml:space="preserve">[Me]</w:t>
-      </w:r>
-      <w:r>
-        <w:t xml:space="preserve"> </w:t>
-      </w:r>
-      <w:r>
+        <w:rPr>
+          <w:iCs/>
+          <w:i/>
+        </w:rPr>
+        <w:t xml:space="preserve">[Me]</w:t>
+      </w:r>
+      <w:r>
+        <w:t xml:space="preserve"> </w:t>
+      </w:r>
+      <w:r>
+        <w:rPr>
+          <w:iCs/>
+          <w:i/>
+        </w:rPr>
         <w:t xml:space="preserve">… okay, does vibe coding make sense here or not?</w:t>
       </w:r>
     </w:p>
@@ -1385,7 +1811,13 @@
         <w:t xml:space="preserve"> </w:t>
       </w:r>
       <w:r>
-        <w:t xml:space="preserve">“Well, we just vibe code it.”</w:t>
+        <w:t xml:space="preserve">“</w:t>
+      </w:r>
+      <w:r>
+        <w:t xml:space="preserve">Well, we just vibe code it.</w:t>
+      </w:r>
+      <w:r>
+        <w:t xml:space="preserve">”</w:t>
       </w:r>
       <w:r>
         <w:t xml:space="preserve"> </w:t>
@@ -1397,7 +1829,13 @@
         <w:t xml:space="preserve"> </w:t>
       </w:r>
       <w:r>
-        <w:t xml:space="preserve">“Maybe we don’t need WordPress, maybe we just vibe code CMS ourselves.”</w:t>
+        <w:t xml:space="preserve">“</w:t>
+      </w:r>
+      <w:r>
+        <w:t xml:space="preserve">Maybe we don’t need WordPress, maybe we just vibe code CMS ourselves.</w:t>
+      </w:r>
+      <w:r>
+        <w:t xml:space="preserve">”</w:t>
       </w:r>
       <w:r>
         <w:t xml:space="preserve"> </w:t>
@@ -1411,12 +1849,20 @@
         <w:pStyle w:val="BlockText"/>
       </w:pPr>
       <w:r>
-        <w:t xml:space="preserve">[Me]</w:t>
-      </w:r>
-      <w:r>
-        <w:t xml:space="preserve"> </w:t>
-      </w:r>
-      <w:r>
+        <w:rPr>
+          <w:iCs/>
+          <w:i/>
+        </w:rPr>
+        <w:t xml:space="preserve">[Me]</w:t>
+      </w:r>
+      <w:r>
+        <w:t xml:space="preserve"> </w:t>
+      </w:r>
+      <w:r>
+        <w:rPr>
+          <w:iCs/>
+          <w:i/>
+        </w:rPr>
         <w:t xml:space="preserve">Yeah. It becomes challenging. Interesting. So, uh, I could talk about this use case for hours. Uh-</w:t>
       </w:r>
     </w:p>
@@ -1439,12 +1885,20 @@
         <w:pStyle w:val="BlockText"/>
       </w:pPr>
       <w:r>
-        <w:t xml:space="preserve">[Me]</w:t>
-      </w:r>
-      <w:r>
-        <w:t xml:space="preserve"> </w:t>
-      </w:r>
-      <w:r>
+        <w:rPr>
+          <w:iCs/>
+          <w:i/>
+        </w:rPr>
+        <w:t xml:space="preserve">[Me]</w:t>
+      </w:r>
+      <w:r>
+        <w:t xml:space="preserve"> </w:t>
+      </w:r>
+      <w:r>
+        <w:rPr>
+          <w:iCs/>
+          <w:i/>
+        </w:rPr>
         <w:t xml:space="preserve">… I’m going to take it a little bit back to some of the other use case because I also want to dive into, uh, benefits that you’re all seeing. So maybe it’s just very good to, uh… and if there are additional risks also just let, let’s also call those out with, uh, like my primary question is benefits. So let, let’s start with the first one, the topic we, we discussed, the customer support, uh, one.</w:t>
       </w:r>
     </w:p>
@@ -1467,12 +1921,20 @@
         <w:pStyle w:val="BlockText"/>
       </w:pPr>
       <w:r>
-        <w:t xml:space="preserve">[Me]</w:t>
-      </w:r>
-      <w:r>
-        <w:t xml:space="preserve"> </w:t>
-      </w:r>
-      <w:r>
+        <w:rPr>
+          <w:iCs/>
+          <w:i/>
+        </w:rPr>
+        <w:t xml:space="preserve">[Me]</w:t>
+      </w:r>
+      <w:r>
+        <w:t xml:space="preserve"> </w:t>
+      </w:r>
+      <w:r>
+        <w:rPr>
+          <w:iCs/>
+          <w:i/>
+        </w:rPr>
         <w:t xml:space="preserve">How is it affecting you that you are now using AI in this process?</w:t>
       </w:r>
     </w:p>
@@ -1493,7 +1955,13 @@
         <w:t xml:space="preserve"> </w:t>
       </w:r>
       <w:r>
-        <w:t xml:space="preserve">“Okay, now everybody’s using it. Don’t care.”</w:t>
+        <w:t xml:space="preserve">“</w:t>
+      </w:r>
+      <w:r>
+        <w:t xml:space="preserve">Okay, now everybody’s using it. Don’t care.</w:t>
+      </w:r>
+      <w:r>
+        <w:t xml:space="preserve">”</w:t>
       </w:r>
       <w:r>
         <w:t xml:space="preserve"> </w:t>
@@ -1507,12 +1975,20 @@
         <w:pStyle w:val="BlockText"/>
       </w:pPr>
       <w:r>
-        <w:t xml:space="preserve">[Me]</w:t>
-      </w:r>
-      <w:r>
-        <w:t xml:space="preserve"> </w:t>
-      </w:r>
-      <w:r>
+        <w:rPr>
+          <w:iCs/>
+          <w:i/>
+        </w:rPr>
+        <w:t xml:space="preserve">[Me]</w:t>
+      </w:r>
+      <w:r>
+        <w:t xml:space="preserve"> </w:t>
+      </w:r>
+      <w:r>
+        <w:rPr>
+          <w:iCs/>
+          <w:i/>
+        </w:rPr>
         <w:t xml:space="preserve">Is that a… What is that? A 60, 70% increase? Is that also-</w:t>
       </w:r>
     </w:p>
@@ -1535,12 +2011,20 @@
         <w:pStyle w:val="BlockText"/>
       </w:pPr>
       <w:r>
-        <w:t xml:space="preserve">[Me]</w:t>
-      </w:r>
-      <w:r>
-        <w:t xml:space="preserve"> </w:t>
-      </w:r>
-      <w:r>
+        <w:rPr>
+          <w:iCs/>
+          <w:i/>
+        </w:rPr>
+        <w:t xml:space="preserve">[Me]</w:t>
+      </w:r>
+      <w:r>
+        <w:t xml:space="preserve"> </w:t>
+      </w:r>
+      <w:r>
+        <w:rPr>
+          <w:iCs/>
+          <w:i/>
+        </w:rPr>
         <w:t xml:space="preserve">… something that you’re looking at?</w:t>
       </w:r>
     </w:p>
@@ -1561,7 +2045,13 @@
         <w:t xml:space="preserve"> </w:t>
       </w:r>
       <w:r>
-        <w:t xml:space="preserve">“We can do this,”</w:t>
+        <w:t xml:space="preserve">“</w:t>
+      </w:r>
+      <w:r>
+        <w:t xml:space="preserve">We can do this,</w:t>
+      </w:r>
+      <w:r>
+        <w:t xml:space="preserve">”</w:t>
       </w:r>
       <w:r>
         <w:t xml:space="preserve"> </w:t>
@@ -1573,7 +2063,13 @@
         <w:t xml:space="preserve"> </w:t>
       </w:r>
       <w:r>
-        <w:t xml:space="preserve">“Hey, maybe it saves three minutes every call or something. Let’s do it.”</w:t>
+        <w:t xml:space="preserve">“</w:t>
+      </w:r>
+      <w:r>
+        <w:t xml:space="preserve">Hey, maybe it saves three minutes every call or something. Let’s do it.</w:t>
+      </w:r>
+      <w:r>
+        <w:t xml:space="preserve">”</w:t>
       </w:r>
       <w:r>
         <w:t xml:space="preserve"> </w:t>
@@ -1587,12 +2083,20 @@
         <w:pStyle w:val="BlockText"/>
       </w:pPr>
       <w:r>
-        <w:t xml:space="preserve">[Me]</w:t>
-      </w:r>
-      <w:r>
-        <w:t xml:space="preserve"> </w:t>
-      </w:r>
-      <w:r>
+        <w:rPr>
+          <w:iCs/>
+          <w:i/>
+        </w:rPr>
+        <w:t xml:space="preserve">[Me]</w:t>
+      </w:r>
+      <w:r>
+        <w:t xml:space="preserve"> </w:t>
+      </w:r>
+      <w:r>
+        <w:rPr>
+          <w:iCs/>
+          <w:i/>
+        </w:rPr>
         <w:t xml:space="preserve">So I’ll ask a follow-up que- question on that later.</w:t>
       </w:r>
     </w:p>
@@ -1615,12 +2119,20 @@
         <w:pStyle w:val="BlockText"/>
       </w:pPr>
       <w:r>
-        <w:t xml:space="preserve">[Me]</w:t>
-      </w:r>
-      <w:r>
-        <w:t xml:space="preserve"> </w:t>
-      </w:r>
-      <w:r>
+        <w:rPr>
+          <w:iCs/>
+          <w:i/>
+        </w:rPr>
+        <w:t xml:space="preserve">[Me]</w:t>
+      </w:r>
+      <w:r>
+        <w:t xml:space="preserve"> </w:t>
+      </w:r>
+      <w:r>
+        <w:rPr>
+          <w:iCs/>
+          <w:i/>
+        </w:rPr>
         <w:t xml:space="preserve">First, let’s go, like, one step back. You talked about feeling in con- feeling like you’re more in control. Is it mainly for you and management, or is done also for the personnel who is using the system?</w:t>
       </w:r>
     </w:p>
@@ -1641,7 +2153,13 @@
         <w:t xml:space="preserve"> </w:t>
       </w:r>
       <w:r>
-        <w:t xml:space="preserve">“What’s going on here?”</w:t>
+        <w:t xml:space="preserve">“</w:t>
+      </w:r>
+      <w:r>
+        <w:t xml:space="preserve">What’s going on here?</w:t>
+      </w:r>
+      <w:r>
+        <w:t xml:space="preserve">”</w:t>
       </w:r>
       <w:r>
         <w:t xml:space="preserve"> </w:t>
@@ -1653,7 +2171,13 @@
         <w:t xml:space="preserve"> </w:t>
       </w:r>
       <w:r>
-        <w:t xml:space="preserve">“Customer support, you guys solve it, you know? Fix it.”</w:t>
+        <w:t xml:space="preserve">“</w:t>
+      </w:r>
+      <w:r>
+        <w:t xml:space="preserve">Customer support, you guys solve it, you know? Fix it.</w:t>
+      </w:r>
+      <w:r>
+        <w:t xml:space="preserve">”</w:t>
       </w:r>
       <w:r>
         <w:t xml:space="preserve"> </w:t>
@@ -1665,7 +2189,13 @@
         <w:t xml:space="preserve"> </w:t>
       </w:r>
       <w:r>
-        <w:t xml:space="preserve">“No, no, no. Marketing, you sent that email that was unclear. Y- you fix it,”</w:t>
+        <w:t xml:space="preserve">“</w:t>
+      </w:r>
+      <w:r>
+        <w:t xml:space="preserve">No, no, no. Marketing, you sent that email that was unclear. Y- you fix it,</w:t>
+      </w:r>
+      <w:r>
+        <w:t xml:space="preserve">”</w:t>
       </w:r>
       <w:r>
         <w:t xml:space="preserve"> </w:t>
@@ -1677,7 +2207,13 @@
         <w:t xml:space="preserve"> </w:t>
       </w:r>
       <w:r>
-        <w:t xml:space="preserve">“This photo isn’t, uh, working. Your job.”</w:t>
+        <w:t xml:space="preserve">“</w:t>
+      </w:r>
+      <w:r>
+        <w:t xml:space="preserve">This photo isn’t, uh, working. Your job.</w:t>
+      </w:r>
+      <w:r>
+        <w:t xml:space="preserve">”</w:t>
       </w:r>
       <w:r>
         <w:t xml:space="preserve"> </w:t>
@@ -1691,12 +2227,20 @@
         <w:pStyle w:val="BlockText"/>
       </w:pPr>
       <w:r>
-        <w:t xml:space="preserve">[Me]</w:t>
-      </w:r>
-      <w:r>
-        <w:t xml:space="preserve"> </w:t>
-      </w:r>
-      <w:r>
+        <w:rPr>
+          <w:iCs/>
+          <w:i/>
+        </w:rPr>
+        <w:t xml:space="preserve">[Me]</w:t>
+      </w:r>
+      <w:r>
+        <w:t xml:space="preserve"> </w:t>
+      </w:r>
+      <w:r>
+        <w:rPr>
+          <w:iCs/>
+          <w:i/>
+        </w:rPr>
         <w:t xml:space="preserve">Yeah. So essentially you’re, you’re running customer led organization triage.</w:t>
       </w:r>
     </w:p>
@@ -1719,12 +2263,20 @@
         <w:pStyle w:val="BlockText"/>
       </w:pPr>
       <w:r>
-        <w:t xml:space="preserve">[Me]</w:t>
-      </w:r>
-      <w:r>
-        <w:t xml:space="preserve"> </w:t>
-      </w:r>
-      <w:r>
+        <w:rPr>
+          <w:iCs/>
+          <w:i/>
+        </w:rPr>
+        <w:t xml:space="preserve">[Me]</w:t>
+      </w:r>
+      <w:r>
+        <w:t xml:space="preserve"> </w:t>
+      </w:r>
+      <w:r>
+        <w:rPr>
+          <w:iCs/>
+          <w:i/>
+        </w:rPr>
         <w:t xml:space="preserve">It’s-</w:t>
       </w:r>
     </w:p>
@@ -1747,12 +2299,20 @@
         <w:pStyle w:val="BlockText"/>
       </w:pPr>
       <w:r>
-        <w:t xml:space="preserve">[Me]</w:t>
-      </w:r>
-      <w:r>
-        <w:t xml:space="preserve"> </w:t>
-      </w:r>
-      <w:r>
+        <w:rPr>
+          <w:iCs/>
+          <w:i/>
+        </w:rPr>
+        <w:t xml:space="preserve">[Me]</w:t>
+      </w:r>
+      <w:r>
+        <w:t xml:space="preserve"> </w:t>
+      </w:r>
+      <w:r>
+        <w:rPr>
+          <w:iCs/>
+          <w:i/>
+        </w:rPr>
         <w:t xml:space="preserve">Yeah. We, we need to write a case about this, Eh. [laughs]</w:t>
       </w:r>
     </w:p>
@@ -1775,12 +2335,20 @@
         <w:pStyle w:val="BlockText"/>
       </w:pPr>
       <w:r>
-        <w:t xml:space="preserve">[Me]</w:t>
-      </w:r>
-      <w:r>
-        <w:t xml:space="preserve"> </w:t>
-      </w:r>
-      <w:r>
+        <w:rPr>
+          <w:iCs/>
+          <w:i/>
+        </w:rPr>
+        <w:t xml:space="preserve">[Me]</w:t>
+      </w:r>
+      <w:r>
+        <w:t xml:space="preserve"> </w:t>
+      </w:r>
+      <w:r>
+        <w:rPr>
+          <w:iCs/>
+          <w:i/>
+        </w:rPr>
         <w:t xml:space="preserve">I love this.</w:t>
       </w:r>
     </w:p>
@@ -1803,12 +2371,20 @@
         <w:pStyle w:val="BlockText"/>
       </w:pPr>
       <w:r>
-        <w:t xml:space="preserve">[Me]</w:t>
-      </w:r>
-      <w:r>
-        <w:t xml:space="preserve"> </w:t>
-      </w:r>
-      <w:r>
+        <w:rPr>
+          <w:iCs/>
+          <w:i/>
+        </w:rPr>
+        <w:t xml:space="preserve">[Me]</w:t>
+      </w:r>
+      <w:r>
+        <w:t xml:space="preserve"> </w:t>
+      </w:r>
+      <w:r>
+        <w:rPr>
+          <w:iCs/>
+          <w:i/>
+        </w:rPr>
         <w:t xml:space="preserve">Also just from a business strategic perspective, it’s such a interesting way to, to talk about customer support, and I know it happens sometimes, like especially in like growth start-upy organizations.</w:t>
       </w:r>
     </w:p>
@@ -1831,12 +2407,20 @@
         <w:pStyle w:val="BlockText"/>
       </w:pPr>
       <w:r>
-        <w:t xml:space="preserve">[Me]</w:t>
-      </w:r>
-      <w:r>
-        <w:t xml:space="preserve"> </w:t>
-      </w:r>
-      <w:r>
+        <w:rPr>
+          <w:iCs/>
+          <w:i/>
+        </w:rPr>
+        <w:t xml:space="preserve">[Me]</w:t>
+      </w:r>
+      <w:r>
+        <w:t xml:space="preserve"> </w:t>
+      </w:r>
+      <w:r>
+        <w:rPr>
+          <w:iCs/>
+          <w:i/>
+        </w:rPr>
         <w:t xml:space="preserve">But-</w:t>
       </w:r>
     </w:p>
@@ -1859,12 +2443,20 @@
         <w:pStyle w:val="BlockText"/>
       </w:pPr>
       <w:r>
-        <w:t xml:space="preserve">[Me]</w:t>
-      </w:r>
-      <w:r>
-        <w:t xml:space="preserve"> </w:t>
-      </w:r>
-      <w:r>
+        <w:rPr>
+          <w:iCs/>
+          <w:i/>
+        </w:rPr>
+        <w:t xml:space="preserve">[Me]</w:t>
+      </w:r>
+      <w:r>
+        <w:t xml:space="preserve"> </w:t>
+      </w:r>
+      <w:r>
+        <w:rPr>
+          <w:iCs/>
+          <w:i/>
+        </w:rPr>
         <w:t xml:space="preserve">… implementing this in your organization after you’ve been around for how many years, and are like-</w:t>
       </w:r>
     </w:p>
@@ -1887,12 +2479,20 @@
         <w:pStyle w:val="BlockText"/>
       </w:pPr>
       <w:r>
-        <w:t xml:space="preserve">[Me]</w:t>
-      </w:r>
-      <w:r>
-        <w:t xml:space="preserve"> </w:t>
-      </w:r>
-      <w:r>
+        <w:rPr>
+          <w:iCs/>
+          <w:i/>
+        </w:rPr>
+        <w:t xml:space="preserve">[Me]</w:t>
+      </w:r>
+      <w:r>
+        <w:t xml:space="preserve"> </w:t>
+      </w:r>
+      <w:r>
+        <w:rPr>
+          <w:iCs/>
+          <w:i/>
+        </w:rPr>
         <w:t xml:space="preserve">… 50. [laughs] And you’re not the youngest organization on the planet, so-</w:t>
       </w:r>
     </w:p>
@@ -1915,12 +2515,20 @@
         <w:pStyle w:val="BlockText"/>
       </w:pPr>
       <w:r>
-        <w:t xml:space="preserve">[Me]</w:t>
-      </w:r>
-      <w:r>
-        <w:t xml:space="preserve"> </w:t>
-      </w:r>
-      <w:r>
+        <w:rPr>
+          <w:iCs/>
+          <w:i/>
+        </w:rPr>
+        <w:t xml:space="preserve">[Me]</w:t>
+      </w:r>
+      <w:r>
+        <w:t xml:space="preserve"> </w:t>
+      </w:r>
+      <w:r>
+        <w:rPr>
+          <w:iCs/>
+          <w:i/>
+        </w:rPr>
         <w:t xml:space="preserve">… it’s pretty cool.</w:t>
       </w:r>
     </w:p>
@@ -1943,12 +2551,20 @@
         <w:pStyle w:val="BlockText"/>
       </w:pPr>
       <w:r>
-        <w:t xml:space="preserve">[Me]</w:t>
-      </w:r>
-      <w:r>
-        <w:t xml:space="preserve"> </w:t>
-      </w:r>
-      <w:r>
+        <w:rPr>
+          <w:iCs/>
+          <w:i/>
+        </w:rPr>
+        <w:t xml:space="preserve">[Me]</w:t>
+      </w:r>
+      <w:r>
+        <w:t xml:space="preserve"> </w:t>
+      </w:r>
+      <w:r>
+        <w:rPr>
+          <w:iCs/>
+          <w:i/>
+        </w:rPr>
         <w:t xml:space="preserve">Um, yeah, I should have known the 50. It’s, it’s [laughs] in your strategic plan. [laughs]</w:t>
       </w:r>
     </w:p>
@@ -1971,21 +2587,55 @@
         <w:pStyle w:val="BlockText"/>
       </w:pPr>
       <w:r>
-        <w:t xml:space="preserve">[Me]</w:t>
-      </w:r>
-      <w:r>
-        <w:t xml:space="preserve"> </w:t>
-      </w:r>
-      <w:r>
+        <w:rPr>
+          <w:iCs/>
+          <w:i/>
+        </w:rPr>
+        <w:t xml:space="preserve">[Me]</w:t>
+      </w:r>
+      <w:r>
+        <w:t xml:space="preserve"> </w:t>
+      </w:r>
+      <w:r>
+        <w:rPr>
+          <w:iCs/>
+          <w:i/>
+        </w:rPr>
         <w:t xml:space="preserve">I, I see now we have discussed, I would say, two big categories, right? We have customer support as one big customer facing, marketing related, uh, element, and you have new propositions that you target the customer with that have been built using AI or have been aided in some way by AI. Do you have any other places where you touch the customer where you say,</w:t>
       </w:r>
       <w:r>
-        <w:t xml:space="preserve"> </w:t>
-      </w:r>
-      <w:r>
-        <w:t xml:space="preserve">“Okay, agentic AI is critical in our process”</w:t>
-      </w:r>
-      <w:r>
+        <w:rPr>
+          <w:iCs/>
+          <w:i/>
+        </w:rPr>
+        <w:t xml:space="preserve"> </w:t>
+      </w:r>
+      <w:r>
+        <w:rPr>
+          <w:iCs/>
+          <w:i/>
+        </w:rPr>
+        <w:t xml:space="preserve">“</w:t>
+      </w:r>
+      <w:r>
+        <w:rPr>
+          <w:iCs/>
+          <w:i/>
+        </w:rPr>
+        <w:t xml:space="preserve">Okay, agentic AI is critical in our process</w:t>
+      </w:r>
+      <w:r>
+        <w:rPr>
+          <w:iCs/>
+          <w:i/>
+        </w:rPr>
+        <w:t xml:space="preserve">”</w:t>
+      </w:r>
+      <w:r>
+        <w:rPr>
+          <w:iCs/>
+          <w:i/>
+        </w:rPr>
         <w:t xml:space="preserve">?</w:t>
       </w:r>
     </w:p>
@@ -2006,13 +2656,25 @@
         <w:t xml:space="preserve"> </w:t>
       </w:r>
       <w:r>
-        <w:t xml:space="preserve">“Oh, I would like to book.”</w:t>
-      </w:r>
-      <w:r>
-        <w:t xml:space="preserve"> </w:t>
-      </w:r>
-      <w:r>
-        <w:t xml:space="preserve">“Okay, we book it for you.”</w:t>
+        <w:t xml:space="preserve">“</w:t>
+      </w:r>
+      <w:r>
+        <w:t xml:space="preserve">Oh, I would like to book.</w:t>
+      </w:r>
+      <w:r>
+        <w:t xml:space="preserve">”</w:t>
+      </w:r>
+      <w:r>
+        <w:t xml:space="preserve"> </w:t>
+      </w:r>
+      <w:r>
+        <w:t xml:space="preserve">“</w:t>
+      </w:r>
+      <w:r>
+        <w:t xml:space="preserve">Okay, we book it for you.</w:t>
+      </w:r>
+      <w:r>
+        <w:t xml:space="preserve">”</w:t>
       </w:r>
       <w:r>
         <w:t xml:space="preserve"> </w:t>
@@ -2026,12 +2688,20 @@
         <w:pStyle w:val="BlockText"/>
       </w:pPr>
       <w:r>
-        <w:t xml:space="preserve">[Me]</w:t>
-      </w:r>
-      <w:r>
-        <w:t xml:space="preserve"> </w:t>
-      </w:r>
-      <w:r>
+        <w:rPr>
+          <w:iCs/>
+          <w:i/>
+        </w:rPr>
+        <w:t xml:space="preserve">[Me]</w:t>
+      </w:r>
+      <w:r>
+        <w:t xml:space="preserve"> </w:t>
+      </w:r>
+      <w:r>
+        <w:rPr>
+          <w:iCs/>
+          <w:i/>
+        </w:rPr>
         <w:t xml:space="preserve">Oh, you’re back again.</w:t>
       </w:r>
     </w:p>
@@ -2054,12 +2724,20 @@
         <w:pStyle w:val="BlockText"/>
       </w:pPr>
       <w:r>
-        <w:t xml:space="preserve">[Me]</w:t>
-      </w:r>
-      <w:r>
-        <w:t xml:space="preserve"> </w:t>
-      </w:r>
-      <w:r>
+        <w:rPr>
+          <w:iCs/>
+          <w:i/>
+        </w:rPr>
+        <w:t xml:space="preserve">[Me]</w:t>
+      </w:r>
+      <w:r>
+        <w:t xml:space="preserve"> </w:t>
+      </w:r>
+      <w:r>
+        <w:rPr>
+          <w:iCs/>
+          <w:i/>
+        </w:rPr>
         <w:t xml:space="preserve">Yeah. You, I missed, like, half a word. It’s okay. [laughs]</w:t>
       </w:r>
     </w:p>
@@ -2082,12 +2760,20 @@
         <w:pStyle w:val="BlockText"/>
       </w:pPr>
       <w:r>
-        <w:t xml:space="preserve">[Me]</w:t>
-      </w:r>
-      <w:r>
-        <w:t xml:space="preserve"> </w:t>
-      </w:r>
-      <w:r>
+        <w:rPr>
+          <w:iCs/>
+          <w:i/>
+        </w:rPr>
+        <w:t xml:space="preserve">[Me]</w:t>
+      </w:r>
+      <w:r>
+        <w:t xml:space="preserve"> </w:t>
+      </w:r>
+      <w:r>
+        <w:rPr>
+          <w:iCs/>
+          <w:i/>
+        </w:rPr>
         <w:t xml:space="preserve">Yeah, I can understand. And if I broaden the question a bit, because you’re mainly talking about, I think, AI solutions that touch the customer, but if you’re thinking about AI solutions that touch the marketing process in a more general way, are you-</w:t>
       </w:r>
     </w:p>
@@ -2110,12 +2796,20 @@
         <w:pStyle w:val="BlockText"/>
       </w:pPr>
       <w:r>
-        <w:t xml:space="preserve">[Me]</w:t>
-      </w:r>
-      <w:r>
-        <w:t xml:space="preserve"> </w:t>
-      </w:r>
-      <w:r>
+        <w:rPr>
+          <w:iCs/>
+          <w:i/>
+        </w:rPr>
+        <w:t xml:space="preserve">[Me]</w:t>
+      </w:r>
+      <w:r>
+        <w:t xml:space="preserve"> </w:t>
+      </w:r>
+      <w:r>
+        <w:rPr>
+          <w:iCs/>
+          <w:i/>
+        </w:rPr>
         <w:t xml:space="preserve">… experimenting there, doing stuff? Uh…</w:t>
       </w:r>
     </w:p>
@@ -2138,12 +2832,20 @@
         <w:pStyle w:val="BlockText"/>
       </w:pPr>
       <w:r>
-        <w:t xml:space="preserve">[Me]</w:t>
-      </w:r>
-      <w:r>
-        <w:t xml:space="preserve"> </w:t>
-      </w:r>
-      <w:r>
+        <w:rPr>
+          <w:iCs/>
+          <w:i/>
+        </w:rPr>
+        <w:t xml:space="preserve">[Me]</w:t>
+      </w:r>
+      <w:r>
+        <w:t xml:space="preserve"> </w:t>
+      </w:r>
+      <w:r>
+        <w:rPr>
+          <w:iCs/>
+          <w:i/>
+        </w:rPr>
         <w:t xml:space="preserve">So how, how is, uh, how is that driving your business now?</w:t>
       </w:r>
     </w:p>
@@ -2166,12 +2868,20 @@
         <w:pStyle w:val="BlockText"/>
       </w:pPr>
       <w:r>
-        <w:t xml:space="preserve">[Me]</w:t>
-      </w:r>
-      <w:r>
-        <w:t xml:space="preserve"> </w:t>
-      </w:r>
-      <w:r>
+        <w:rPr>
+          <w:iCs/>
+          <w:i/>
+        </w:rPr>
+        <w:t xml:space="preserve">[Me]</w:t>
+      </w:r>
+      <w:r>
+        <w:t xml:space="preserve"> </w:t>
+      </w:r>
+      <w:r>
+        <w:rPr>
+          <w:iCs/>
+          <w:i/>
+        </w:rPr>
         <w:t xml:space="preserve">Yeah. So I’ll throw something out, and I’m just very curious about your reaction because what-</w:t>
       </w:r>
     </w:p>
@@ -2194,12 +2904,20 @@
         <w:pStyle w:val="BlockText"/>
       </w:pPr>
       <w:r>
-        <w:t xml:space="preserve">[Me]</w:t>
-      </w:r>
-      <w:r>
-        <w:t xml:space="preserve"> </w:t>
-      </w:r>
-      <w:r>
+        <w:rPr>
+          <w:iCs/>
+          <w:i/>
+        </w:rPr>
+        <w:t xml:space="preserve">[Me]</w:t>
+      </w:r>
+      <w:r>
+        <w:t xml:space="preserve"> </w:t>
+      </w:r>
+      <w:r>
+        <w:rPr>
+          <w:iCs/>
+          <w:i/>
+        </w:rPr>
         <w:t xml:space="preserve">some people have been saying is that, yes, we have always been talking in marketing about targeting the individual customer, like, and is one, and going-</w:t>
       </w:r>
     </w:p>
@@ -2222,12 +2940,20 @@
         <w:pStyle w:val="BlockText"/>
       </w:pPr>
       <w:r>
-        <w:t xml:space="preserve">[Me]</w:t>
-      </w:r>
-      <w:r>
-        <w:t xml:space="preserve"> </w:t>
-      </w:r>
-      <w:r>
+        <w:rPr>
+          <w:iCs/>
+          <w:i/>
+        </w:rPr>
+        <w:t xml:space="preserve">[Me]</w:t>
+      </w:r>
+      <w:r>
+        <w:t xml:space="preserve"> </w:t>
+      </w:r>
+      <w:r>
+        <w:rPr>
+          <w:iCs/>
+          <w:i/>
+        </w:rPr>
         <w:t xml:space="preserve">… all of the way there and making, like, all these detailed segmentations and automating that target audience specifically and blah, blah, blah. And we’ve always been talking about it, but we have never really been doing it. And now that we have AI, we can actually measure what we have been doing, make more granular segmentations, and in doing that, um, actually do personalization on a much more granular level and target better in that way.</w:t>
       </w:r>
     </w:p>
@@ -2250,12 +2976,20 @@
         <w:pStyle w:val="BlockText"/>
       </w:pPr>
       <w:r>
-        <w:t xml:space="preserve">[Me]</w:t>
-      </w:r>
-      <w:r>
-        <w:t xml:space="preserve"> </w:t>
-      </w:r>
-      <w:r>
+        <w:rPr>
+          <w:iCs/>
+          <w:i/>
+        </w:rPr>
+        <w:t xml:space="preserve">[Me]</w:t>
+      </w:r>
+      <w:r>
+        <w:t xml:space="preserve"> </w:t>
+      </w:r>
+      <w:r>
+        <w:rPr>
+          <w:iCs/>
+          <w:i/>
+        </w:rPr>
         <w:t xml:space="preserve">given that, that context or that, that, that idea is floating out there, how, how are you looking at that? Is that something that is just not interesting for you now, uh, or-</w:t>
       </w:r>
     </w:p>
@@ -2278,12 +3012,20 @@
         <w:pStyle w:val="BlockText"/>
       </w:pPr>
       <w:r>
-        <w:t xml:space="preserve">[Me]</w:t>
-      </w:r>
-      <w:r>
-        <w:t xml:space="preserve"> </w:t>
-      </w:r>
-      <w:r>
+        <w:rPr>
+          <w:iCs/>
+          <w:i/>
+        </w:rPr>
+        <w:t xml:space="preserve">[Me]</w:t>
+      </w:r>
+      <w:r>
+        <w:t xml:space="preserve"> </w:t>
+      </w:r>
+      <w:r>
+        <w:rPr>
+          <w:iCs/>
+          <w:i/>
+        </w:rPr>
         <w:t xml:space="preserve">… where you’re at or, um, is it just not something that is on the radar in the first place?</w:t>
       </w:r>
     </w:p>
@@ -2306,12 +3048,20 @@
         <w:pStyle w:val="BlockText"/>
       </w:pPr>
       <w:r>
-        <w:t xml:space="preserve">[Me]</w:t>
-      </w:r>
-      <w:r>
-        <w:t xml:space="preserve"> </w:t>
-      </w:r>
-      <w:r>
+        <w:rPr>
+          <w:iCs/>
+          <w:i/>
+        </w:rPr>
+        <w:t xml:space="preserve">[Me]</w:t>
+      </w:r>
+      <w:r>
+        <w:t xml:space="preserve"> </w:t>
+      </w:r>
+      <w:r>
+        <w:rPr>
+          <w:iCs/>
+          <w:i/>
+        </w:rPr>
         <w:t xml:space="preserve">Yeah. So th- that’s an interesting thought as well because at some point that’s true, like your feed is unique. On the other hand, every bit of content is-</w:t>
       </w:r>
     </w:p>
@@ -2334,12 +3084,20 @@
         <w:pStyle w:val="BlockText"/>
       </w:pPr>
       <w:r>
-        <w:t xml:space="preserve">[Me]</w:t>
-      </w:r>
-      <w:r>
-        <w:t xml:space="preserve"> </w:t>
-      </w:r>
-      <w:r>
+        <w:rPr>
+          <w:iCs/>
+          <w:i/>
+        </w:rPr>
+        <w:t xml:space="preserve">[Me]</w:t>
+      </w:r>
+      <w:r>
+        <w:t xml:space="preserve"> </w:t>
+      </w:r>
+      <w:r>
+        <w:rPr>
+          <w:iCs/>
+          <w:i/>
+        </w:rPr>
         <w:t xml:space="preserve">… not unique. [laughs]</w:t>
       </w:r>
     </w:p>
@@ -2362,24 +3120,62 @@
         <w:pStyle w:val="BlockText"/>
       </w:pPr>
       <w:r>
-        <w:t xml:space="preserve">[Me]</w:t>
-      </w:r>
-      <w:r>
-        <w:t xml:space="preserve"> </w:t>
-      </w:r>
-      <w:r>
+        <w:rPr>
+          <w:iCs/>
+          <w:i/>
+        </w:rPr>
+        <w:t xml:space="preserve">[Me]</w:t>
+      </w:r>
+      <w:r>
+        <w:t xml:space="preserve"> </w:t>
+      </w:r>
+      <w:r>
+        <w:rPr>
+          <w:iCs/>
+          <w:i/>
+        </w:rPr>
         <w:t xml:space="preserve">Um, but it’s super interesting because essentially you’re saying like,</w:t>
       </w:r>
       <w:r>
-        <w:t xml:space="preserve"> </w:t>
-      </w:r>
-      <w:r>
-        <w:t xml:space="preserve">“Hey, if we want to do N as one at all, we first need to build the data.”</w:t>
-      </w:r>
-      <w:r>
-        <w:t xml:space="preserve"> </w:t>
-      </w:r>
-      <w:r>
+        <w:rPr>
+          <w:iCs/>
+          <w:i/>
+        </w:rPr>
+        <w:t xml:space="preserve"> </w:t>
+      </w:r>
+      <w:r>
+        <w:rPr>
+          <w:iCs/>
+          <w:i/>
+        </w:rPr>
+        <w:t xml:space="preserve">“</w:t>
+      </w:r>
+      <w:r>
+        <w:rPr>
+          <w:iCs/>
+          <w:i/>
+        </w:rPr>
+        <w:t xml:space="preserve">Hey, if we want to do N as one at all, we first need to build the data.</w:t>
+      </w:r>
+      <w:r>
+        <w:rPr>
+          <w:iCs/>
+          <w:i/>
+        </w:rPr>
+        <w:t xml:space="preserve">”</w:t>
+      </w:r>
+      <w:r>
+        <w:rPr>
+          <w:iCs/>
+          <w:i/>
+        </w:rPr>
+        <w:t xml:space="preserve"> </w:t>
+      </w:r>
+      <w:r>
+        <w:rPr>
+          <w:iCs/>
+          <w:i/>
+        </w:rPr>
         <w:t xml:space="preserve">And you’re now-</w:t>
       </w:r>
     </w:p>
@@ -2402,12 +3198,20 @@
         <w:pStyle w:val="BlockText"/>
       </w:pPr>
       <w:r>
-        <w:t xml:space="preserve">[Me]</w:t>
-      </w:r>
-      <w:r>
-        <w:t xml:space="preserve"> </w:t>
-      </w:r>
-      <w:r>
+        <w:rPr>
+          <w:iCs/>
+          <w:i/>
+        </w:rPr>
+        <w:t xml:space="preserve">[Me]</w:t>
+      </w:r>
+      <w:r>
+        <w:t xml:space="preserve"> </w:t>
+      </w:r>
+      <w:r>
+        <w:rPr>
+          <w:iCs/>
+          <w:i/>
+        </w:rPr>
         <w:t xml:space="preserve">… s- bringing in, in action the, the processes where you can-</w:t>
       </w:r>
     </w:p>
@@ -2430,12 +3234,20 @@
         <w:pStyle w:val="BlockText"/>
       </w:pPr>
       <w:r>
-        <w:t xml:space="preserve">[Me]</w:t>
-      </w:r>
-      <w:r>
-        <w:t xml:space="preserve"> </w:t>
-      </w:r>
-      <w:r>
+        <w:rPr>
+          <w:iCs/>
+          <w:i/>
+        </w:rPr>
+        <w:t xml:space="preserve">[Me]</w:t>
+      </w:r>
+      <w:r>
+        <w:t xml:space="preserve"> </w:t>
+      </w:r>
+      <w:r>
+        <w:rPr>
+          <w:iCs/>
+          <w:i/>
+        </w:rPr>
         <w:t xml:space="preserve">… draw in the customers to actually leave that data.</w:t>
       </w:r>
     </w:p>
@@ -2456,7 +3268,13 @@
         <w:t xml:space="preserve"> </w:t>
       </w:r>
       <w:r>
-        <w:t xml:space="preserve">“Hey, you’re an existing customer. How do we upsell you something? We need to know all these things about you to really be able to upsell you something,”</w:t>
+        <w:t xml:space="preserve">“</w:t>
+      </w:r>
+      <w:r>
+        <w:t xml:space="preserve">Hey, you’re an existing customer. How do we upsell you something? We need to know all these things about you to really be able to upsell you something,</w:t>
+      </w:r>
+      <w:r>
+        <w:t xml:space="preserve">”</w:t>
       </w:r>
       <w:r>
         <w:t xml:space="preserve"> </w:t>
@@ -2470,12 +3288,20 @@
         <w:pStyle w:val="BlockText"/>
       </w:pPr>
       <w:r>
-        <w:t xml:space="preserve">[Me]</w:t>
-      </w:r>
-      <w:r>
-        <w:t xml:space="preserve"> </w:t>
-      </w:r>
-      <w:r>
+        <w:rPr>
+          <w:iCs/>
+          <w:i/>
+        </w:rPr>
+        <w:t xml:space="preserve">[Me]</w:t>
+      </w:r>
+      <w:r>
+        <w:t xml:space="preserve"> </w:t>
+      </w:r>
+      <w:r>
+        <w:rPr>
+          <w:iCs/>
+          <w:i/>
+        </w:rPr>
         <w:t xml:space="preserve">So th- this, this feels to me like something that is, it’s not unique, but it’s something that differentiates NKC, or how you, uh, and I think in your work and others in the organization are looking at this from the vast majority of organizations. Because I think in the vast majority of organizations, there is a product, and for the marketing department, that has just been given. And they have no-</w:t>
       </w:r>
     </w:p>
@@ -2498,12 +3324,20 @@
         <w:pStyle w:val="BlockText"/>
       </w:pPr>
       <w:r>
-        <w:t xml:space="preserve">[Me]</w:t>
-      </w:r>
-      <w:r>
-        <w:t xml:space="preserve"> </w:t>
-      </w:r>
-      <w:r>
+        <w:rPr>
+          <w:iCs/>
+          <w:i/>
+        </w:rPr>
+        <w:t xml:space="preserve">[Me]</w:t>
+      </w:r>
+      <w:r>
+        <w:t xml:space="preserve"> </w:t>
+      </w:r>
+      <w:r>
+        <w:rPr>
+          <w:iCs/>
+          <w:i/>
+        </w:rPr>
         <w:t xml:space="preserve">… control or influence or whatever on what the product is and what it does. They just have to sell it, right?</w:t>
       </w:r>
     </w:p>
@@ -2526,12 +3360,20 @@
         <w:pStyle w:val="BlockText"/>
       </w:pPr>
       <w:r>
-        <w:t xml:space="preserve">[Me]</w:t>
-      </w:r>
-      <w:r>
-        <w:t xml:space="preserve"> </w:t>
-      </w:r>
-      <w:r>
+        <w:rPr>
+          <w:iCs/>
+          <w:i/>
+        </w:rPr>
+        <w:t xml:space="preserve">[Me]</w:t>
+      </w:r>
+      <w:r>
+        <w:t xml:space="preserve"> </w:t>
+      </w:r>
+      <w:r>
+        <w:rPr>
+          <w:iCs/>
+          <w:i/>
+        </w:rPr>
         <w:t xml:space="preserve">Um, how do you think that affects your view on marketing and how you… Uh, uh, we, we need to bring this back to AI in some way, but it feels like- [laughs]</w:t>
       </w:r>
     </w:p>
@@ -2554,12 +3396,20 @@
         <w:pStyle w:val="BlockText"/>
       </w:pPr>
       <w:r>
-        <w:t xml:space="preserve">[Me]</w:t>
-      </w:r>
-      <w:r>
-        <w:t xml:space="preserve"> </w:t>
-      </w:r>
-      <w:r>
+        <w:rPr>
+          <w:iCs/>
+          <w:i/>
+        </w:rPr>
+        <w:t xml:space="preserve">[Me]</w:t>
+      </w:r>
+      <w:r>
+        <w:t xml:space="preserve"> </w:t>
+      </w:r>
+      <w:r>
+        <w:rPr>
+          <w:iCs/>
+          <w:i/>
+        </w:rPr>
         <w:t xml:space="preserve">… there’s something very key here-</w:t>
       </w:r>
     </w:p>
@@ -2582,12 +3432,20 @@
         <w:pStyle w:val="BlockText"/>
       </w:pPr>
       <w:r>
-        <w:t xml:space="preserve">[Me]</w:t>
-      </w:r>
-      <w:r>
-        <w:t xml:space="preserve"> </w:t>
-      </w:r>
-      <w:r>
+        <w:rPr>
+          <w:iCs/>
+          <w:i/>
+        </w:rPr>
+        <w:t xml:space="preserve">[Me]</w:t>
+      </w:r>
+      <w:r>
+        <w:t xml:space="preserve"> </w:t>
+      </w:r>
+      <w:r>
+        <w:rPr>
+          <w:iCs/>
+          <w:i/>
+        </w:rPr>
         <w:t xml:space="preserve">… that I, uh, would love-</w:t>
       </w:r>
     </w:p>
@@ -2610,12 +3468,20 @@
         <w:pStyle w:val="BlockText"/>
       </w:pPr>
       <w:r>
-        <w:t xml:space="preserve">[Me]</w:t>
-      </w:r>
-      <w:r>
-        <w:t xml:space="preserve"> </w:t>
-      </w:r>
-      <w:r>
+        <w:rPr>
+          <w:iCs/>
+          <w:i/>
+        </w:rPr>
+        <w:t xml:space="preserve">[Me]</w:t>
+      </w:r>
+      <w:r>
+        <w:t xml:space="preserve"> </w:t>
+      </w:r>
+      <w:r>
+        <w:rPr>
+          <w:iCs/>
+          <w:i/>
+        </w:rPr>
         <w:t xml:space="preserve">… to get at.</w:t>
       </w:r>
     </w:p>
@@ -2638,12 +3504,20 @@
         <w:pStyle w:val="BlockText"/>
       </w:pPr>
       <w:r>
-        <w:t xml:space="preserve">[Me]</w:t>
-      </w:r>
-      <w:r>
-        <w:t xml:space="preserve"> </w:t>
-      </w:r>
-      <w:r>
+        <w:rPr>
+          <w:iCs/>
+          <w:i/>
+        </w:rPr>
+        <w:t xml:space="preserve">[Me]</w:t>
+      </w:r>
+      <w:r>
+        <w:t xml:space="preserve"> </w:t>
+      </w:r>
+      <w:r>
+        <w:rPr>
+          <w:iCs/>
+          <w:i/>
+        </w:rPr>
         <w:t xml:space="preserve">Oh, I’m making a lot of notes, so [laughs]</w:t>
       </w:r>
     </w:p>
@@ -2666,12 +3540,20 @@
         <w:pStyle w:val="BlockText"/>
       </w:pPr>
       <w:r>
-        <w:t xml:space="preserve">[Me]</w:t>
-      </w:r>
-      <w:r>
-        <w:t xml:space="preserve"> </w:t>
-      </w:r>
-      <w:r>
+        <w:rPr>
+          <w:iCs/>
+          <w:i/>
+        </w:rPr>
+        <w:t xml:space="preserve">[Me]</w:t>
+      </w:r>
+      <w:r>
+        <w:t xml:space="preserve"> </w:t>
+      </w:r>
+      <w:r>
+        <w:rPr>
+          <w:iCs/>
+          <w:i/>
+        </w:rPr>
         <w:t xml:space="preserve">At least I think it’s interesting. [laughs]</w:t>
       </w:r>
     </w:p>
@@ -2694,12 +3576,20 @@
         <w:pStyle w:val="BlockText"/>
       </w:pPr>
       <w:r>
-        <w:t xml:space="preserve">[Me]</w:t>
-      </w:r>
-      <w:r>
-        <w:t xml:space="preserve"> </w:t>
-      </w:r>
-      <w:r>
+        <w:rPr>
+          <w:iCs/>
+          <w:i/>
+        </w:rPr>
+        <w:t xml:space="preserve">[Me]</w:t>
+      </w:r>
+      <w:r>
+        <w:t xml:space="preserve"> </w:t>
+      </w:r>
+      <w:r>
+        <w:rPr>
+          <w:iCs/>
+          <w:i/>
+        </w:rPr>
         <w:t xml:space="preserve">Yeah, I think it does. I think it does. And I also think, uh, uh, correct me if I’m wrong, but you are a little bit of a product person, right? So you think of the customer, but you also think like-</w:t>
       </w:r>
     </w:p>
@@ -2722,12 +3612,20 @@
         <w:pStyle w:val="BlockText"/>
       </w:pPr>
       <w:r>
-        <w:t xml:space="preserve">[Me]</w:t>
-      </w:r>
-      <w:r>
-        <w:t xml:space="preserve"> </w:t>
-      </w:r>
-      <w:r>
+        <w:rPr>
+          <w:iCs/>
+          <w:i/>
+        </w:rPr>
+        <w:t xml:space="preserve">[Me]</w:t>
+      </w:r>
+      <w:r>
+        <w:t xml:space="preserve"> </w:t>
+      </w:r>
+      <w:r>
+        <w:rPr>
+          <w:iCs/>
+          <w:i/>
+        </w:rPr>
         <w:t xml:space="preserve">… how, how does our products affect our customer. And I’m also curious if I would get a very different story if I talked to somebody from, what’s maybe like your, your Google Ads now, right? Something like that.</w:t>
       </w:r>
     </w:p>
@@ -2750,12 +3648,20 @@
         <w:pStyle w:val="BlockText"/>
       </w:pPr>
       <w:r>
-        <w:t xml:space="preserve">[Me]</w:t>
-      </w:r>
-      <w:r>
-        <w:t xml:space="preserve"> </w:t>
-      </w:r>
-      <w:r>
+        <w:rPr>
+          <w:iCs/>
+          <w:i/>
+        </w:rPr>
+        <w:t xml:space="preserve">[Me]</w:t>
+      </w:r>
+      <w:r>
+        <w:t xml:space="preserve"> </w:t>
+      </w:r>
+      <w:r>
+        <w:rPr>
+          <w:iCs/>
+          <w:i/>
+        </w:rPr>
         <w:t xml:space="preserve">How do you think about that? Does, does this mindset really… Is it really ingrained in the organization or is that really something that’s only at the top?</w:t>
       </w:r>
     </w:p>
@@ -2778,12 +3684,20 @@
         <w:pStyle w:val="BlockText"/>
       </w:pPr>
       <w:r>
-        <w:t xml:space="preserve">[Me]</w:t>
-      </w:r>
-      <w:r>
-        <w:t xml:space="preserve"> </w:t>
-      </w:r>
-      <w:r>
+        <w:rPr>
+          <w:iCs/>
+          <w:i/>
+        </w:rPr>
+        <w:t xml:space="preserve">[Me]</w:t>
+      </w:r>
+      <w:r>
+        <w:t xml:space="preserve"> </w:t>
+      </w:r>
+      <w:r>
+        <w:rPr>
+          <w:iCs/>
+          <w:i/>
+        </w:rPr>
         <w:t xml:space="preserve">So we’re almost out of time. If… I, I have, like, this wild other question. If, if you would like to fix any problem with AI, what, what would be, like, the next thing for you to, to solve? [laughs]</w:t>
       </w:r>
     </w:p>
@@ -2806,12 +3720,20 @@
         <w:pStyle w:val="BlockText"/>
       </w:pPr>
       <w:r>
-        <w:t xml:space="preserve">[Me]</w:t>
-      </w:r>
-      <w:r>
-        <w:t xml:space="preserve"> </w:t>
-      </w:r>
-      <w:r>
+        <w:rPr>
+          <w:iCs/>
+          <w:i/>
+        </w:rPr>
+        <w:t xml:space="preserve">[Me]</w:t>
+      </w:r>
+      <w:r>
+        <w:t xml:space="preserve"> </w:t>
+      </w:r>
+      <w:r>
+        <w:rPr>
+          <w:iCs/>
+          <w:i/>
+        </w:rPr>
         <w:t xml:space="preserve">Uh, the, the, the thing that you want to solve. Uh-</w:t>
       </w:r>
     </w:p>
@@ -2834,12 +3756,20 @@
         <w:pStyle w:val="BlockText"/>
       </w:pPr>
       <w:r>
-        <w:t xml:space="preserve">[Me]</w:t>
-      </w:r>
-      <w:r>
-        <w:t xml:space="preserve"> </w:t>
-      </w:r>
-      <w:r>
+        <w:rPr>
+          <w:iCs/>
+          <w:i/>
+        </w:rPr>
+        <w:t xml:space="preserve">[Me]</w:t>
+      </w:r>
+      <w:r>
+        <w:t xml:space="preserve"> </w:t>
+      </w:r>
+      <w:r>
+        <w:rPr>
+          <w:iCs/>
+          <w:i/>
+        </w:rPr>
         <w:t xml:space="preserve">Uh-huh.</w:t>
       </w:r>
     </w:p>
@@ -2862,12 +3792,20 @@
         <w:pStyle w:val="BlockText"/>
       </w:pPr>
       <w:r>
-        <w:t xml:space="preserve">[Me]</w:t>
-      </w:r>
-      <w:r>
-        <w:t xml:space="preserve"> </w:t>
-      </w:r>
-      <w:r>
+        <w:rPr>
+          <w:iCs/>
+          <w:i/>
+        </w:rPr>
+        <w:t xml:space="preserve">[Me]</w:t>
+      </w:r>
+      <w:r>
+        <w:t xml:space="preserve"> </w:t>
+      </w:r>
+      <w:r>
+        <w:rPr>
+          <w:iCs/>
+          <w:i/>
+        </w:rPr>
         <w:t xml:space="preserve">Cool. Yeah. [lacht] I get it. There’s a lot of stories. Okay. Do, do you have any, any last thoughts that you want to share or anything else of, uh, like key takeaways that we didn’t touch on?</w:t>
       </w:r>
     </w:p>
@@ -2890,12 +3828,20 @@
         <w:pStyle w:val="BlockText"/>
       </w:pPr>
       <w:r>
-        <w:t xml:space="preserve">[Me]</w:t>
-      </w:r>
-      <w:r>
-        <w:t xml:space="preserve"> </w:t>
-      </w:r>
-      <w:r>
+        <w:rPr>
+          <w:iCs/>
+          <w:i/>
+        </w:rPr>
+        <w:t xml:space="preserve">[Me]</w:t>
+      </w:r>
+      <w:r>
+        <w:t xml:space="preserve"> </w:t>
+      </w:r>
+      <w:r>
+        <w:rPr>
+          <w:iCs/>
+          <w:i/>
+        </w:rPr>
         <w:t xml:space="preserve">Yeah. Yeah. Interesting. Also, I think that is a very eloquent way of, uh, noting that and very correct. Um, okay.</w:t>
       </w:r>
     </w:p>
@@ -2918,12 +3864,20 @@
         <w:pStyle w:val="BlockText"/>
       </w:pPr>
       <w:r>
-        <w:t xml:space="preserve">[Me]</w:t>
-      </w:r>
-      <w:r>
-        <w:t xml:space="preserve"> </w:t>
-      </w:r>
-      <w:r>
+        <w:rPr>
+          <w:iCs/>
+          <w:i/>
+        </w:rPr>
+        <w:t xml:space="preserve">[Me]</w:t>
+      </w:r>
+      <w:r>
+        <w:t xml:space="preserve"> </w:t>
+      </w:r>
+      <w:r>
+        <w:rPr>
+          <w:iCs/>
+          <w:i/>
+        </w:rPr>
         <w:t xml:space="preserve">Well, I want to thank you in the very last minute that I, uh, I have with you. [lacht] Ik denk dat het ook in het Nederlands kan. Nee, maar echt superbedankt. Ik, uh, ik vind dat je, uh, echt s-super fijne input, uh, alle kanten uit. Ook weer leuk dat jullie echt een hele ander type organisatie zijn dan, uh, mensen die ik normaal spreek. En ja, ik, ik heb echt het gevoel dat ik nog wel twee uur meer kan praten, maar dan, d-dat is de hoop dat ik de meest, uh, waardevolle dingen al te pakken heb.</w:t>
       </w:r>
     </w:p>
@@ -2946,12 +3900,20 @@
         <w:pStyle w:val="BlockText"/>
       </w:pPr>
       <w:r>
-        <w:t xml:space="preserve">[Me]</w:t>
-      </w:r>
-      <w:r>
-        <w:t xml:space="preserve"> </w:t>
-      </w:r>
-      <w:r>
+        <w:rPr>
+          <w:iCs/>
+          <w:i/>
+        </w:rPr>
+        <w:t xml:space="preserve">[Me]</w:t>
+      </w:r>
+      <w:r>
+        <w:t xml:space="preserve"> </w:t>
+      </w:r>
+      <w:r>
+        <w:rPr>
+          <w:iCs/>
+          <w:i/>
+        </w:rPr>
         <w:t xml:space="preserve">Heb je nog mensen waarvan je zegt van: ja, deze, deze gast in onze organisatie heeft hier zo’n ander beeld bij. Die moet je eigenlijk ook spreken om te zorgen dat je een beetje het, het echte NKC-verhaal hebt. Of, uh…</w:t>
       </w:r>
     </w:p>
@@ -2974,12 +3936,20 @@
         <w:pStyle w:val="BlockText"/>
       </w:pPr>
       <w:r>
-        <w:t xml:space="preserve">[Me]</w:t>
-      </w:r>
-      <w:r>
-        <w:t xml:space="preserve"> </w:t>
-      </w:r>
-      <w:r>
+        <w:rPr>
+          <w:iCs/>
+          <w:i/>
+        </w:rPr>
+        <w:t xml:space="preserve">[Me]</w:t>
+      </w:r>
+      <w:r>
+        <w:t xml:space="preserve"> </w:t>
+      </w:r>
+      <w:r>
+        <w:rPr>
+          <w:iCs/>
+          <w:i/>
+        </w:rPr>
         <w:t xml:space="preserve">Ik vind het altijd wat, wat ik wel leuk vind, doe ik ook bij sommige andere organisaties, is om iemand te hebben die een expert is en iemand die echt soort van in de marketingoperatie zit en het allemaal mag gebruiken. Uh, da-dan zie je toch wel vaak echt een gat ook weer tussen wat die twee, uh, mensen, mensen groepen denken.</w:t>
       </w:r>
     </w:p>
@@ -3002,12 +3972,20 @@
         <w:pStyle w:val="BlockText"/>
       </w:pPr>
       <w:r>
-        <w:t xml:space="preserve">[Me]</w:t>
-      </w:r>
-      <w:r>
-        <w:t xml:space="preserve"> </w:t>
-      </w:r>
-      <w:r>
+        <w:rPr>
+          <w:iCs/>
+          <w:i/>
+        </w:rPr>
+        <w:t xml:space="preserve">[Me]</w:t>
+      </w:r>
+      <w:r>
+        <w:t xml:space="preserve"> </w:t>
+      </w:r>
+      <w:r>
+        <w:rPr>
+          <w:iCs/>
+          <w:i/>
+        </w:rPr>
         <w:t xml:space="preserve">Oké, ik zal het, uh, ik zal het eens vragen, want ik denk dat dat, zeker als ik een paar dingen aanraak vanuit het gesprek wat wij gehad hadden, denk ik dat er wel wat, uh, wat interessante patronen uit kunnen komen.</w:t>
       </w:r>
     </w:p>
@@ -3030,12 +4008,20 @@
         <w:pStyle w:val="BlockText"/>
       </w:pPr>
       <w:r>
-        <w:t xml:space="preserve">[Me]</w:t>
-      </w:r>
-      <w:r>
-        <w:t xml:space="preserve"> </w:t>
-      </w:r>
-      <w:r>
+        <w:rPr>
+          <w:iCs/>
+          <w:i/>
+        </w:rPr>
+        <w:t xml:space="preserve">[Me]</w:t>
+      </w:r>
+      <w:r>
+        <w:t xml:space="preserve"> </w:t>
+      </w:r>
+      <w:r>
+        <w:rPr>
+          <w:iCs/>
+          <w:i/>
+        </w:rPr>
         <w:t xml:space="preserve">Cool. Ja, super, super! Hartstikke bedankt, uh, Erik. Uh, erg fijn. Erg fijn. En, uh, ik kan je sowieso even de research sturen als ik het allemaal af heb. Uh, dan denk ik-</w:t>
       </w:r>
     </w:p>
@@ -3058,12 +4044,20 @@
         <w:pStyle w:val="BlockText"/>
       </w:pPr>
       <w:r>
-        <w:t xml:space="preserve">[Me]</w:t>
-      </w:r>
-      <w:r>
-        <w:t xml:space="preserve"> </w:t>
-      </w:r>
-      <w:r>
+        <w:rPr>
+          <w:iCs/>
+          <w:i/>
+        </w:rPr>
+        <w:t xml:space="preserve">[Me]</w:t>
+      </w:r>
+      <w:r>
+        <w:t xml:space="preserve"> </w:t>
+      </w:r>
+      <w:r>
+        <w:rPr>
+          <w:iCs/>
+          <w:i/>
+        </w:rPr>
         <w:t xml:space="preserve">Ja, dank je.</w:t>
       </w:r>
     </w:p>
@@ -3086,12 +4080,20 @@
         <w:pStyle w:val="BlockText"/>
       </w:pPr>
       <w:r>
-        <w:t xml:space="preserve">[Me]</w:t>
-      </w:r>
-      <w:r>
-        <w:t xml:space="preserve"> </w:t>
-      </w:r>
-      <w:r>
+        <w:rPr>
+          <w:iCs/>
+          <w:i/>
+        </w:rPr>
+        <w:t xml:space="preserve">[Me]</w:t>
+      </w:r>
+      <w:r>
+        <w:t xml:space="preserve"> </w:t>
+      </w:r>
+      <w:r>
+        <w:rPr>
+          <w:iCs/>
+          <w:i/>
+        </w:rPr>
         <w:t xml:space="preserve">Ook weer een beetje dank met NKC, hè, want, uh, ik moest één, uh, referentie indienen en dat is Ingeborg toen geweest. [lacht]</w:t>
       </w:r>
     </w:p>
@@ -3114,12 +4116,20 @@
         <w:pStyle w:val="BlockText"/>
       </w:pPr>
       <w:r>
-        <w:t xml:space="preserve">[Me]</w:t>
-      </w:r>
-      <w:r>
-        <w:t xml:space="preserve"> </w:t>
-      </w:r>
-      <w:r>
+        <w:rPr>
+          <w:iCs/>
+          <w:i/>
+        </w:rPr>
+        <w:t xml:space="preserve">[Me]</w:t>
+      </w:r>
+      <w:r>
+        <w:t xml:space="preserve"> </w:t>
+      </w:r>
+      <w:r>
+        <w:rPr>
+          <w:iCs/>
+          <w:i/>
+        </w:rPr>
         <w:t xml:space="preserve">En die heeft echt een superleuk berichtje ook gestuurd. Die heeft nog lang bijgestuurd. Het was, uh, dat was heel lief.</w:t>
       </w:r>
     </w:p>
@@ -3142,12 +4152,20 @@
         <w:pStyle w:val="BlockText"/>
       </w:pPr>
       <w:r>
-        <w:t xml:space="preserve">[Me]</w:t>
-      </w:r>
-      <w:r>
-        <w:t xml:space="preserve"> </w:t>
-      </w:r>
-      <w:r>
+        <w:rPr>
+          <w:iCs/>
+          <w:i/>
+        </w:rPr>
+        <w:t xml:space="preserve">[Me]</w:t>
+      </w:r>
+      <w:r>
+        <w:t xml:space="preserve"> </w:t>
+      </w:r>
+      <w:r>
+        <w:rPr>
+          <w:iCs/>
+          <w:i/>
+        </w:rPr>
         <w:t xml:space="preserve">Dus, uh.</w:t>
       </w:r>
     </w:p>
@@ -3170,12 +4188,20 @@
         <w:pStyle w:val="BlockText"/>
       </w:pPr>
       <w:r>
-        <w:t xml:space="preserve">[Me]</w:t>
-      </w:r>
-      <w:r>
-        <w:t xml:space="preserve"> </w:t>
-      </w:r>
-      <w:r>
+        <w:rPr>
+          <w:iCs/>
+          <w:i/>
+        </w:rPr>
+        <w:t xml:space="preserve">[Me]</w:t>
+      </w:r>
+      <w:r>
+        <w:t xml:space="preserve"> </w:t>
+      </w:r>
+      <w:r>
+        <w:rPr>
+          <w:iCs/>
+          <w:i/>
+        </w:rPr>
         <w:t xml:space="preserve">Ja, en, en we doen natuurlijk supermooie dingen samen, weet je, dat, uh.</w:t>
       </w:r>
     </w:p>
@@ -3198,12 +4224,20 @@
         <w:pStyle w:val="BlockText"/>
       </w:pPr>
       <w:r>
-        <w:t xml:space="preserve">[Me]</w:t>
-      </w:r>
-      <w:r>
-        <w:t xml:space="preserve"> </w:t>
-      </w:r>
-      <w:r>
+        <w:rPr>
+          <w:iCs/>
+          <w:i/>
+        </w:rPr>
+        <w:t xml:space="preserve">[Me]</w:t>
+      </w:r>
+      <w:r>
+        <w:t xml:space="preserve"> </w:t>
+      </w:r>
+      <w:r>
+        <w:rPr>
+          <w:iCs/>
+          <w:i/>
+        </w:rPr>
         <w:t xml:space="preserve">Daar blijf ik echt wel, uh, echt, echt wel trots op, op alles samen met je te bereiken.</w:t>
       </w:r>
     </w:p>
@@ -3226,12 +4260,20 @@
         <w:pStyle w:val="BlockText"/>
       </w:pPr>
       <w:r>
-        <w:t xml:space="preserve">[Me]</w:t>
-      </w:r>
-      <w:r>
-        <w:t xml:space="preserve"> </w:t>
-      </w:r>
-      <w:r>
+        <w:rPr>
+          <w:iCs/>
+          <w:i/>
+        </w:rPr>
+        <w:t xml:space="preserve">[Me]</w:t>
+      </w:r>
+      <w:r>
+        <w:t xml:space="preserve"> </w:t>
+      </w:r>
+      <w:r>
+        <w:rPr>
+          <w:iCs/>
+          <w:i/>
+        </w:rPr>
         <w:t xml:space="preserve">Oké, dan, uh, laat ik jou weer los, want we zijn al twee minuten over tijd, hè. Uh, ja, aan de ene kant wel leuk. Ik heb, uh, studievakantie, maar, uh, ik denk dat jij werkt natuurlijk echt vandaag. [lacht]</w:t>
       </w:r>
     </w:p>
@@ -3254,12 +4296,20 @@
         <w:pStyle w:val="BlockText"/>
       </w:pPr>
       <w:r>
-        <w:t xml:space="preserve">[Me]</w:t>
-      </w:r>
-      <w:r>
-        <w:t xml:space="preserve"> </w:t>
-      </w:r>
-      <w:r>
+        <w:rPr>
+          <w:iCs/>
+          <w:i/>
+        </w:rPr>
+        <w:t xml:space="preserve">[Me]</w:t>
+      </w:r>
+      <w:r>
+        <w:t xml:space="preserve"> </w:t>
+      </w:r>
+      <w:r>
+        <w:rPr>
+          <w:iCs/>
+          <w:i/>
+        </w:rPr>
         <w:t xml:space="preserve">Thanks!</w:t>
       </w:r>
     </w:p>
@@ -3282,12 +4332,20 @@
         <w:pStyle w:val="BlockText"/>
       </w:pPr>
       <w:r>
-        <w:t xml:space="preserve">[Me]</w:t>
-      </w:r>
-      <w:r>
-        <w:t xml:space="preserve"> </w:t>
-      </w:r>
-      <w:r>
+        <w:rPr>
+          <w:iCs/>
+          <w:i/>
+        </w:rPr>
+        <w:t xml:space="preserve">[Me]</w:t>
+      </w:r>
+      <w:r>
+        <w:t xml:space="preserve"> </w:t>
+      </w:r>
+      <w:r>
+        <w:rPr>
+          <w:iCs/>
+          <w:i/>
+        </w:rPr>
         <w:t xml:space="preserve">Tof. Cool. Oké, spreek elkaar. Hé, tot snel. Ciao ciao!</w:t>
       </w:r>
     </w:p>
@@ -3305,11 +4363,7 @@
         <w:t xml:space="preserve">Yes. Ciao ciao. [zingt]</w:t>
       </w:r>
     </w:p>
-    <w:sectPr>
-      <w:footnotePr>
-        <w:numRestart w:val="eachSect"/>
-      </w:footnotePr>
-    </w:sectPr>
+    <w:sectPr/>
   </w:body>
 </w:document>
 </file>
@@ -3340,14 +4394,14 @@
 <file path=word/numbering.xml><?xml version="1.0" encoding="utf-8"?>
 <w:numbering xmlns:w="http://schemas.openxmlformats.org/wordprocessingml/2006/main">
   <w:abstractNum w:abstractNumId="990">
-    <w:nsid w:val="0000A990"/>
+    <w:nsid w:val="A990"/>
     <w:multiLevelType w:val="multilevel"/>
     <w:lvl w:ilvl="0">
       <w:numFmt w:val="bullet"/>
       <w:lvlText w:val=" "/>
       <w:lvlJc w:val="left"/>
       <w:pPr>
-        <w:ind w:left="720" w:hanging="360"/>
+        <w:ind w:left="720" w:hanging="480"/>
       </w:pPr>
     </w:lvl>
     <w:lvl w:ilvl="1">
@@ -3355,7 +4409,7 @@
       <w:lvlText w:val=" "/>
       <w:lvlJc w:val="left"/>
       <w:pPr>
-        <w:ind w:left="1440" w:hanging="360"/>
+        <w:ind w:left="1440" w:hanging="480"/>
       </w:pPr>
     </w:lvl>
     <w:lvl w:ilvl="2">
@@ -3363,7 +4417,7 @@
       <w:lvlText w:val=" "/>
       <w:lvlJc w:val="left"/>
       <w:pPr>
-        <w:ind w:left="2160" w:hanging="360"/>
+        <w:ind w:left="2160" w:hanging="480"/>
       </w:pPr>
     </w:lvl>
     <w:lvl w:ilvl="3">
@@ -3371,7 +4425,7 @@
       <w:lvlText w:val=" "/>
       <w:lvlJc w:val="left"/>
       <w:pPr>
-        <w:ind w:left="2880" w:hanging="360"/>
+        <w:ind w:left="2880" w:hanging="480"/>
       </w:pPr>
     </w:lvl>
     <w:lvl w:ilvl="4">
@@ -3379,7 +4433,7 @@
       <w:lvlText w:val=" "/>
       <w:lvlJc w:val="left"/>
       <w:pPr>
-        <w:ind w:left="3600" w:hanging="360"/>
+        <w:ind w:left="3600" w:hanging="480"/>
       </w:pPr>
     </w:lvl>
     <w:lvl w:ilvl="5">
@@ -3387,7 +4441,7 @@
       <w:lvlText w:val=" "/>
       <w:lvlJc w:val="left"/>
       <w:pPr>
-        <w:ind w:left="4320" w:hanging="360"/>
+        <w:ind w:left="4320" w:hanging="480"/>
       </w:pPr>
     </w:lvl>
     <w:lvl w:ilvl="6">
@@ -3395,7 +4449,7 @@
       <w:lvlText w:val=" "/>
       <w:lvlJc w:val="left"/>
       <w:pPr>
-        <w:ind w:left="5040" w:hanging="360"/>
+        <w:ind w:left="5040" w:hanging="480"/>
       </w:pPr>
     </w:lvl>
     <w:lvl w:ilvl="7">
@@ -3403,7 +4457,7 @@
       <w:lvlText w:val=" "/>
       <w:lvlJc w:val="left"/>
       <w:pPr>
-        <w:ind w:left="5760" w:hanging="360"/>
+        <w:ind w:left="5760" w:hanging="480"/>
       </w:pPr>
     </w:lvl>
     <w:lvl w:ilvl="8">
@@ -3411,7 +4465,7 @@
       <w:lvlText w:val=" "/>
       <w:lvlJc w:val="left"/>
       <w:pPr>
-        <w:ind w:left="6480" w:hanging="360"/>
+        <w:ind w:left="6480" w:hanging="480"/>
       </w:pPr>
     </w:lvl>
   </w:abstractNum>
@@ -3426,10 +4480,10 @@
   <w:docDefaults>
     <w:rPrDefault>
       <w:rPr>
-        <w:rFonts w:asciiTheme="minorHAnsi" w:cstheme="minorBidi" w:eastAsiaTheme="minorEastAsia" w:hAnsiTheme="minorHAnsi"/>
+        <w:rFonts w:asciiTheme="minorHAnsi" w:cstheme="minorBidi" w:eastAsiaTheme="minorHAnsi" w:hAnsiTheme="minorHAnsi"/>
         <w:sz w:val="24"/>
         <w:szCs w:val="24"/>
-        <w:lang w:bidi="ar-SA" w:eastAsia="zh-CN" w:val="en-US"/>
+        <w:lang w:bidi="ar-SA" w:eastAsia="en-US" w:val="en-US"/>
       </w:rPr>
     </w:rPrDefault>
     <w:pPrDefault>
@@ -3447,10 +4501,10 @@
     <w:name w:val="Body Text"/>
     <w:basedOn w:val="Normal"/>
     <w:link w:val="BodyTextChar"/>
-    <w:qFormat/>
     <w:pPr>
       <w:spacing w:after="180" w:before="180"/>
     </w:pPr>
+    <w:qFormat/>
   </w:style>
   <w:style w:customStyle="1" w:styleId="FirstParagraph" w:type="paragraph">
     <w:name w:val="First Paragraph"/>
@@ -3470,94 +4524,57 @@
     <w:name w:val="Title"/>
     <w:basedOn w:val="Normal"/>
     <w:next w:val="BodyText"/>
-    <w:link w:val="TitleChar"/>
-    <w:uiPriority w:val="10"/>
     <w:qFormat/>
-    <w:rsid w:val="00A10FD9"/>
     <w:pPr>
-      <w:spacing w:after="80" w:line="240" w:lineRule="auto"/>
-      <w:contextualSpacing/>
+      <w:keepNext/>
+      <w:keepLines/>
+      <w:spacing w:after="240" w:before="480"/>
       <w:jc w:val="center"/>
     </w:pPr>
     <w:rPr>
       <w:rFonts w:asciiTheme="majorHAnsi" w:cstheme="majorBidi" w:eastAsiaTheme="majorEastAsia" w:hAnsiTheme="majorHAnsi"/>
-      <w:sz w:val="56"/>
-      <w:szCs w:val="56"/>
-    </w:rPr>
-  </w:style>
-  <w:style w:customStyle="1" w:styleId="TitleChar" w:type="character">
-    <w:name w:val="Title Char"/>
-    <w:basedOn w:val="DefaultParagraphFont"/>
-    <w:link w:val="Title"/>
-    <w:uiPriority w:val="10"/>
-    <w:rsid w:val="00A10FD9"/>
-    <w:rPr>
-      <w:rFonts w:asciiTheme="majorHAnsi" w:cstheme="majorBidi" w:eastAsiaTheme="majorEastAsia" w:hAnsiTheme="majorHAnsi"/>
-      <w:sz w:val="56"/>
-      <w:szCs w:val="56"/>
+      <w:b/>
+      <w:bCs/>
+      <w:color w:themeColor="accent1" w:themeShade="B5" w:val="345A8A"/>
+      <w:sz w:val="36"/>
+      <w:szCs w:val="36"/>
     </w:rPr>
   </w:style>
   <w:style w:styleId="Subtitle" w:type="paragraph">
     <w:name w:val="Subtitle"/>
-    <w:basedOn w:val="Title"/>
-    <w:next w:val="BodyText"/>
-    <w:link w:val="SubtitleChar"/>
-    <w:uiPriority w:val="11"/>
-    <w:qFormat/>
-    <w:rsid w:val="00A10FD9"/>
-    <w:pPr>
-      <w:numPr>
-        <w:ilvl w:val="1"/>
-      </w:numPr>
-    </w:pPr>
-    <w:rPr>
-      <w:rFonts w:cstheme="majorBidi" w:eastAsiaTheme="majorEastAsia"/>
-      <w:spacing w:val="15"/>
-      <w:sz w:val="28"/>
-      <w:szCs w:val="28"/>
-    </w:rPr>
-  </w:style>
-  <w:style w:customStyle="1" w:styleId="SubtitleChar" w:type="character">
-    <w:name w:val="Subtitle Char"/>
-    <w:basedOn w:val="DefaultParagraphFont"/>
-    <w:link w:val="Subtitle"/>
-    <w:uiPriority w:val="11"/>
-    <w:rsid w:val="00A10FD9"/>
-    <w:rPr>
-      <w:rFonts w:cstheme="majorBidi" w:eastAsiaTheme="majorEastAsia"/>
-      <w:color w:themeColor="text1" w:themeTint="A6" w:val="595959"/>
-      <w:spacing w:val="15"/>
-      <w:sz w:val="28"/>
-      <w:szCs w:val="28"/>
-    </w:rPr>
-  </w:style>
-  <w:style w:customStyle="1" w:styleId="Author" w:type="paragraph">
-    <w:name w:val="Author"/>
     <w:basedOn w:val="Title"/>
     <w:next w:val="BodyText"/>
     <w:qFormat/>
     <w:pPr>
       <w:keepNext/>
       <w:keepLines/>
+      <w:spacing w:after="240" w:before="240"/>
+      <w:jc w:val="center"/>
     </w:pPr>
     <w:rPr>
-      <w:sz w:val="24"/>
-      <w:szCs w:val="24"/>
+      <w:sz w:val="30"/>
+      <w:szCs w:val="30"/>
     </w:rPr>
   </w:style>
-  <w:style w:styleId="Date" w:type="paragraph">
-    <w:name w:val="Date"/>
-    <w:basedOn w:val="Title"/>
+  <w:style w:customStyle="1" w:styleId="Author" w:type="paragraph">
+    <w:name w:val="Author"/>
     <w:next w:val="BodyText"/>
     <w:qFormat/>
     <w:pPr>
       <w:keepNext/>
       <w:keepLines/>
+      <w:jc w:val="center"/>
     </w:pPr>
-    <w:rPr>
-      <w:sz w:val="24"/>
-      <w:szCs w:val="24"/>
-    </w:rPr>
+  </w:style>
+  <w:style w:styleId="Date" w:type="paragraph">
+    <w:name w:val="Date"/>
+    <w:next w:val="BodyText"/>
+    <w:qFormat/>
+    <w:pPr>
+      <w:keepNext/>
+      <w:keepLines/>
+      <w:jc w:val="center"/>
+    </w:pPr>
   </w:style>
   <w:style w:customStyle="1" w:styleId="AbstractTitle" w:type="paragraph">
     <w:name w:val="Abstract Title"/>
@@ -3567,13 +4584,15 @@
     <w:pPr>
       <w:keepNext/>
       <w:keepLines/>
+      <w:jc w:val="center"/>
       <w:spacing w:after="0" w:before="300"/>
-      <w:jc w:val="center"/>
     </w:pPr>
     <w:rPr>
-      <w:b/>
       <w:sz w:val="20"/>
       <w:szCs w:val="20"/>
+      <w:b/>
+      <w:color w:val="345A8A"/>
+      &gt;
     </w:rPr>
   </w:style>
   <w:style w:customStyle="1" w:styleId="Abstract" w:type="paragraph">
@@ -3600,321 +4619,191 @@
     <w:rPr/>
   </w:style>
   <w:style w:styleId="Heading1" w:type="paragraph">
-    <w:name w:val="heading 1"/>
+    <w:name w:val="Heading 1"/>
     <w:basedOn w:val="Normal"/>
     <w:next w:val="BodyText"/>
-    <w:link w:val="Heading1Char"/>
     <w:uiPriority w:val="9"/>
     <w:qFormat/>
-    <w:rsid w:val="00A10FD9"/>
     <w:pPr>
       <w:keepNext/>
       <w:keepLines/>
-      <w:spacing w:after="80" w:before="360"/>
+      <w:spacing w:after="0" w:before="480"/>
       <w:outlineLvl w:val="0"/>
     </w:pPr>
     <w:rPr>
       <w:rFonts w:asciiTheme="majorHAnsi" w:cstheme="majorBidi" w:eastAsiaTheme="majorEastAsia" w:hAnsiTheme="majorHAnsi"/>
-      <w:color w:themeColor="accent1" w:themeShade="BF" w:val="0F4761"/>
-      <w:sz w:val="40"/>
-      <w:szCs w:val="40"/>
+      <w:b/>
+      <w:bCs/>
+      <w:color w:themeColor="accent1" w:val="4F81BD"/>
+      <w:sz w:val="32"/>
+      <w:szCs w:val="32"/>
     </w:rPr>
   </w:style>
   <w:style w:styleId="Heading2" w:type="paragraph">
-    <w:name w:val="heading 2"/>
+    <w:name w:val="Heading 2"/>
     <w:basedOn w:val="Normal"/>
     <w:next w:val="BodyText"/>
-    <w:link w:val="Heading2Char"/>
     <w:uiPriority w:val="9"/>
-    <w:semiHidden/>
     <w:unhideWhenUsed/>
     <w:qFormat/>
-    <w:rsid w:val="00A10FD9"/>
     <w:pPr>
       <w:keepNext/>
       <w:keepLines/>
-      <w:spacing w:after="80" w:before="160"/>
+      <w:spacing w:after="0" w:before="200"/>
       <w:outlineLvl w:val="1"/>
     </w:pPr>
     <w:rPr>
       <w:rFonts w:asciiTheme="majorHAnsi" w:cstheme="majorBidi" w:eastAsiaTheme="majorEastAsia" w:hAnsiTheme="majorHAnsi"/>
-      <w:color w:themeColor="accent1" w:themeShade="BF" w:val="0F4761"/>
-      <w:sz w:val="32"/>
-      <w:szCs w:val="32"/>
+      <w:b/>
+      <w:bCs/>
+      <w:color w:themeColor="accent1" w:val="4F81BD"/>
+      <w:sz w:val="28"/>
+      <w:szCs w:val="28"/>
     </w:rPr>
   </w:style>
   <w:style w:styleId="Heading3" w:type="paragraph">
-    <w:name w:val="heading 3"/>
+    <w:name w:val="Heading 3"/>
     <w:basedOn w:val="Normal"/>
     <w:next w:val="BodyText"/>
-    <w:link w:val="Heading3Char"/>
     <w:uiPriority w:val="9"/>
-    <w:semiHidden/>
     <w:unhideWhenUsed/>
     <w:qFormat/>
-    <w:rsid w:val="00A10FD9"/>
     <w:pPr>
       <w:keepNext/>
       <w:keepLines/>
-      <w:spacing w:after="80" w:before="160"/>
+      <w:spacing w:after="0" w:before="200"/>
       <w:outlineLvl w:val="2"/>
     </w:pPr>
     <w:rPr>
-      <w:rFonts w:cstheme="majorBidi" w:eastAsiaTheme="majorEastAsia"/>
-      <w:color w:themeColor="accent1" w:themeShade="BF" w:val="0F4761"/>
-      <w:sz w:val="28"/>
-      <w:szCs w:val="28"/>
+      <w:rFonts w:asciiTheme="majorHAnsi" w:cstheme="majorBidi" w:eastAsiaTheme="majorEastAsia" w:hAnsiTheme="majorHAnsi"/>
+      <w:b/>
+      <w:bCs/>
+      <w:color w:themeColor="accent1" w:val="4F81BD"/>
+      <w:sz w:val="24"/>
+      <w:szCs w:val="24"/>
     </w:rPr>
   </w:style>
   <w:style w:styleId="Heading4" w:type="paragraph">
-    <w:name w:val="heading 4"/>
+    <w:name w:val="Heading 4"/>
     <w:basedOn w:val="Normal"/>
     <w:next w:val="BodyText"/>
-    <w:link w:val="Heading4Char"/>
     <w:uiPriority w:val="9"/>
-    <w:semiHidden/>
     <w:unhideWhenUsed/>
     <w:qFormat/>
-    <w:rsid w:val="00A10FD9"/>
     <w:pPr>
       <w:keepNext/>
       <w:keepLines/>
-      <w:spacing w:after="40" w:before="80"/>
+      <w:spacing w:after="0" w:before="200"/>
       <w:outlineLvl w:val="3"/>
     </w:pPr>
     <w:rPr>
-      <w:rFonts w:cstheme="majorBidi" w:eastAsiaTheme="majorEastAsia"/>
+      <w:rFonts w:asciiTheme="majorHAnsi" w:cstheme="majorBidi" w:eastAsiaTheme="majorEastAsia" w:hAnsiTheme="majorHAnsi"/>
       <w:i/>
-      <w:iCs/>
-      <w:color w:themeColor="accent1" w:themeShade="BF" w:val="0F4761"/>
+      <w:bCs/>
+      <w:color w:themeColor="accent1" w:val="4F81BD"/>
+      <w:sz w:val="24"/>
+      <w:szCs w:val="24"/>
     </w:rPr>
   </w:style>
   <w:style w:styleId="Heading5" w:type="paragraph">
-    <w:name w:val="heading 5"/>
+    <w:name w:val="Heading 5"/>
     <w:basedOn w:val="Normal"/>
     <w:next w:val="BodyText"/>
-    <w:link w:val="Heading5Char"/>
     <w:uiPriority w:val="9"/>
-    <w:semiHidden/>
     <w:unhideWhenUsed/>
     <w:qFormat/>
-    <w:rsid w:val="00A10FD9"/>
     <w:pPr>
       <w:keepNext/>
       <w:keepLines/>
-      <w:spacing w:after="40" w:before="80"/>
+      <w:spacing w:after="0" w:before="200"/>
       <w:outlineLvl w:val="4"/>
     </w:pPr>
     <w:rPr>
-      <w:rFonts w:cstheme="majorBidi" w:eastAsiaTheme="majorEastAsia"/>
-      <w:color w:themeColor="accent1" w:themeShade="BF" w:val="0F4761"/>
+      <w:rFonts w:asciiTheme="majorHAnsi" w:cstheme="majorBidi" w:eastAsiaTheme="majorEastAsia" w:hAnsiTheme="majorHAnsi"/>
+      <w:iCs/>
+      <w:color w:themeColor="accent1" w:val="4F81BD"/>
+      <w:sz w:val="24"/>
+      <w:szCs w:val="24"/>
     </w:rPr>
   </w:style>
   <w:style w:styleId="Heading6" w:type="paragraph">
-    <w:name w:val="heading 6"/>
+    <w:name w:val="Heading 6"/>
     <w:basedOn w:val="Normal"/>
     <w:next w:val="BodyText"/>
-    <w:link w:val="Heading6Char"/>
     <w:uiPriority w:val="9"/>
-    <w:semiHidden/>
     <w:unhideWhenUsed/>
     <w:qFormat/>
-    <w:rsid w:val="00A10FD9"/>
     <w:pPr>
       <w:keepNext/>
       <w:keepLines/>
-      <w:spacing w:after="0" w:before="40"/>
+      <w:spacing w:after="0" w:before="200"/>
       <w:outlineLvl w:val="5"/>
     </w:pPr>
     <w:rPr>
-      <w:rFonts w:cstheme="majorBidi" w:eastAsiaTheme="majorEastAsia"/>
-      <w:i/>
-      <w:iCs/>
-      <w:color w:themeColor="text1" w:themeTint="A6" w:val="595959"/>
+      <w:rFonts w:asciiTheme="majorHAnsi" w:cstheme="majorBidi" w:eastAsiaTheme="majorEastAsia" w:hAnsiTheme="majorHAnsi"/>
+      <w:color w:themeColor="accent1" w:val="4F81BD"/>
+      <w:sz w:val="24"/>
+      <w:szCs w:val="24"/>
     </w:rPr>
   </w:style>
   <w:style w:styleId="Heading7" w:type="paragraph">
-    <w:name w:val="heading 7"/>
+    <w:name w:val="Heading 7"/>
     <w:basedOn w:val="Normal"/>
     <w:next w:val="BodyText"/>
-    <w:link w:val="Heading7Char"/>
     <w:uiPriority w:val="9"/>
-    <w:semiHidden/>
     <w:unhideWhenUsed/>
     <w:qFormat/>
-    <w:rsid w:val="00A10FD9"/>
     <w:pPr>
       <w:keepNext/>
       <w:keepLines/>
-      <w:spacing w:after="0" w:before="40"/>
+      <w:spacing w:after="0" w:before="200"/>
       <w:outlineLvl w:val="6"/>
     </w:pPr>
     <w:rPr>
-      <w:rFonts w:cstheme="majorBidi" w:eastAsiaTheme="majorEastAsia"/>
-      <w:color w:themeColor="text1" w:themeTint="A6" w:val="595959"/>
+      <w:rFonts w:asciiTheme="majorHAnsi" w:cstheme="majorBidi" w:eastAsiaTheme="majorEastAsia" w:hAnsiTheme="majorHAnsi"/>
+      <w:color w:themeColor="accent1" w:val="4F81BD"/>
+      <w:sz w:val="24"/>
+      <w:szCs w:val="24"/>
     </w:rPr>
   </w:style>
   <w:style w:styleId="Heading8" w:type="paragraph">
-    <w:name w:val="heading 8"/>
+    <w:name w:val="Heading 8"/>
     <w:basedOn w:val="Normal"/>
     <w:next w:val="BodyText"/>
-    <w:link w:val="Heading8Char"/>
     <w:uiPriority w:val="9"/>
-    <w:semiHidden/>
     <w:unhideWhenUsed/>
     <w:qFormat/>
-    <w:rsid w:val="00A10FD9"/>
     <w:pPr>
       <w:keepNext/>
       <w:keepLines/>
-      <w:spacing w:after="0"/>
+      <w:spacing w:after="0" w:before="200"/>
       <w:outlineLvl w:val="7"/>
     </w:pPr>
     <w:rPr>
-      <w:rFonts w:cstheme="majorBidi" w:eastAsiaTheme="majorEastAsia"/>
-      <w:i/>
-      <w:iCs/>
-      <w:color w:themeColor="text1" w:themeTint="D8" w:val="272727"/>
+      <w:rFonts w:asciiTheme="majorHAnsi" w:cstheme="majorBidi" w:eastAsiaTheme="majorEastAsia" w:hAnsiTheme="majorHAnsi"/>
+      <w:color w:themeColor="accent1" w:val="4F81BD"/>
+      <w:sz w:val="24"/>
+      <w:szCs w:val="24"/>
     </w:rPr>
   </w:style>
   <w:style w:styleId="Heading9" w:type="paragraph">
-    <w:name w:val="heading 9"/>
+    <w:name w:val="Heading 9"/>
     <w:basedOn w:val="Normal"/>
     <w:next w:val="BodyText"/>
-    <w:link w:val="Heading9Char"/>
     <w:uiPriority w:val="9"/>
-    <w:semiHidden/>
     <w:unhideWhenUsed/>
     <w:qFormat/>
-    <w:rsid w:val="00A10FD9"/>
     <w:pPr>
       <w:keepNext/>
       <w:keepLines/>
-      <w:spacing w:after="0"/>
+      <w:spacing w:after="0" w:before="200"/>
       <w:outlineLvl w:val="8"/>
     </w:pPr>
     <w:rPr>
-      <w:rFonts w:cstheme="majorBidi" w:eastAsiaTheme="majorEastAsia"/>
-      <w:color w:themeColor="text1" w:themeTint="D8" w:val="272727"/>
-    </w:rPr>
-  </w:style>
-  <w:style w:customStyle="1" w:styleId="Heading1Char" w:type="character">
-    <w:name w:val="Heading 1 Char"/>
-    <w:basedOn w:val="DefaultParagraphFont"/>
-    <w:link w:val="Heading1"/>
-    <w:uiPriority w:val="9"/>
-    <w:rsid w:val="00A10FD9"/>
-    <w:rPr>
       <w:rFonts w:asciiTheme="majorHAnsi" w:cstheme="majorBidi" w:eastAsiaTheme="majorEastAsia" w:hAnsiTheme="majorHAnsi"/>
-      <w:color w:themeColor="accent1" w:themeShade="BF" w:val="0F4761"/>
-      <w:sz w:val="40"/>
-      <w:szCs w:val="40"/>
-    </w:rPr>
-  </w:style>
-  <w:style w:customStyle="1" w:styleId="Heading2Char" w:type="character">
-    <w:name w:val="Heading 2 Char"/>
-    <w:basedOn w:val="DefaultParagraphFont"/>
-    <w:link w:val="Heading2"/>
-    <w:uiPriority w:val="9"/>
-    <w:semiHidden/>
-    <w:rsid w:val="00A10FD9"/>
-    <w:rPr>
-      <w:rFonts w:asciiTheme="majorHAnsi" w:cstheme="majorBidi" w:eastAsiaTheme="majorEastAsia" w:hAnsiTheme="majorHAnsi"/>
-      <w:color w:themeColor="accent1" w:themeShade="BF" w:val="0F4761"/>
-      <w:sz w:val="32"/>
-      <w:szCs w:val="32"/>
-    </w:rPr>
-  </w:style>
-  <w:style w:customStyle="1" w:styleId="Heading3Char" w:type="character">
-    <w:name w:val="Heading 3 Char"/>
-    <w:basedOn w:val="DefaultParagraphFont"/>
-    <w:link w:val="Heading3"/>
-    <w:uiPriority w:val="9"/>
-    <w:semiHidden/>
-    <w:rsid w:val="00A10FD9"/>
-    <w:rPr>
-      <w:rFonts w:cstheme="majorBidi" w:eastAsiaTheme="majorEastAsia"/>
-      <w:color w:themeColor="accent1" w:themeShade="BF" w:val="0F4761"/>
-      <w:sz w:val="28"/>
-      <w:szCs w:val="28"/>
-    </w:rPr>
-  </w:style>
-  <w:style w:customStyle="1" w:styleId="Heading4Char" w:type="character">
-    <w:name w:val="Heading 4 Char"/>
-    <w:basedOn w:val="DefaultParagraphFont"/>
-    <w:link w:val="Heading4"/>
-    <w:uiPriority w:val="9"/>
-    <w:semiHidden/>
-    <w:rsid w:val="00A10FD9"/>
-    <w:rPr>
-      <w:rFonts w:cstheme="majorBidi" w:eastAsiaTheme="majorEastAsia"/>
-      <w:i/>
-      <w:iCs/>
-      <w:color w:themeColor="accent1" w:themeShade="BF" w:val="0F4761"/>
-    </w:rPr>
-  </w:style>
-  <w:style w:customStyle="1" w:styleId="Heading5Char" w:type="character">
-    <w:name w:val="Heading 5 Char"/>
-    <w:basedOn w:val="DefaultParagraphFont"/>
-    <w:link w:val="Heading5"/>
-    <w:uiPriority w:val="9"/>
-    <w:semiHidden/>
-    <w:rsid w:val="00A10FD9"/>
-    <w:rPr>
-      <w:rFonts w:cstheme="majorBidi" w:eastAsiaTheme="majorEastAsia"/>
-      <w:color w:themeColor="accent1" w:themeShade="BF" w:val="0F4761"/>
-    </w:rPr>
-  </w:style>
-  <w:style w:customStyle="1" w:styleId="Heading6Char" w:type="character">
-    <w:name w:val="Heading 6 Char"/>
-    <w:basedOn w:val="DefaultParagraphFont"/>
-    <w:link w:val="Heading6"/>
-    <w:uiPriority w:val="9"/>
-    <w:semiHidden/>
-    <w:rsid w:val="00A10FD9"/>
-    <w:rPr>
-      <w:rFonts w:cstheme="majorBidi" w:eastAsiaTheme="majorEastAsia"/>
-      <w:i/>
-      <w:iCs/>
-      <w:color w:themeColor="text1" w:themeTint="A6" w:val="595959"/>
-    </w:rPr>
-  </w:style>
-  <w:style w:customStyle="1" w:styleId="Heading7Char" w:type="character">
-    <w:name w:val="Heading 7 Char"/>
-    <w:basedOn w:val="DefaultParagraphFont"/>
-    <w:link w:val="Heading7"/>
-    <w:uiPriority w:val="9"/>
-    <w:semiHidden/>
-    <w:rsid w:val="00A10FD9"/>
-    <w:rPr>
-      <w:rFonts w:cstheme="majorBidi" w:eastAsiaTheme="majorEastAsia"/>
-      <w:color w:themeColor="text1" w:themeTint="A6" w:val="595959"/>
-    </w:rPr>
-  </w:style>
-  <w:style w:customStyle="1" w:styleId="Heading8Char" w:type="character">
-    <w:name w:val="Heading 8 Char"/>
-    <w:basedOn w:val="DefaultParagraphFont"/>
-    <w:link w:val="Heading8"/>
-    <w:uiPriority w:val="9"/>
-    <w:semiHidden/>
-    <w:rsid w:val="00A10FD9"/>
-    <w:rPr>
-      <w:rFonts w:cstheme="majorBidi" w:eastAsiaTheme="majorEastAsia"/>
-      <w:i/>
-      <w:iCs/>
-      <w:color w:themeColor="text1" w:themeTint="D8" w:val="272727"/>
-    </w:rPr>
-  </w:style>
-  <w:style w:customStyle="1" w:styleId="Heading9Char" w:type="character">
-    <w:name w:val="Heading 9 Char"/>
-    <w:basedOn w:val="DefaultParagraphFont"/>
-    <w:link w:val="Heading9"/>
-    <w:uiPriority w:val="9"/>
-    <w:semiHidden/>
-    <w:rsid w:val="00A10FD9"/>
-    <w:rPr>
-      <w:rFonts w:cstheme="majorBidi" w:eastAsiaTheme="majorEastAsia"/>
-      <w:color w:themeColor="text1" w:themeTint="D8" w:val="272727"/>
+      <w:color w:themeColor="accent1" w:val="4F81BD"/>
+      <w:sz w:val="24"/>
+      <w:szCs w:val="24"/>
     </w:rPr>
   </w:style>
   <w:style w:styleId="BlockText" w:type="paragraph">
@@ -3936,18 +4825,6 @@
     <w:uiPriority w:val="9"/>
     <w:unhideWhenUsed/>
     <w:qFormat/>
-  </w:style>
-  <w:style w:styleId="FootnoteBlockText" w:type="paragraph">
-    <w:name w:val="Footnote Block Text"/>
-    <w:basedOn w:val="FootnoteText"/>
-    <w:next w:val="FootnoteText"/>
-    <w:uiPriority w:val="9"/>
-    <w:unhideWhenUsed/>
-    <w:qFormat/>
-    <w:pPr>
-      <w:spacing w:after="100" w:before="100"/>
-      <w:ind w:firstLine="0" w:left="480" w:right="480"/>
-    </w:pPr>
   </w:style>
   <w:style w:default="1" w:styleId="DefaultParagraphFont" w:type="character">
     <w:name w:val="Default Paragraph Font"/>
@@ -3970,11 +4847,18 @@
       </w:tblCellMar>
     </w:tblPr>
     <w:tblStylePr w:type="firstRow">
+      <w:tblPr>
+        <w:jc w:val="left"/>
+        <w:tblInd w:type="dxa" w:w="0"/>
+      </w:tblPr>
+      <w:trPr>
+        <w:jc w:val="left"/>
+      </w:trPr>
       <w:tcPr>
+        <w:vAlign w:val="bottom"/>
         <w:tcBorders>
           <w:bottom w:val="single"/>
         </w:tcBorders>
-        <w:vAlign w:val="bottom"/>
       </w:tcPr>
     </w:tblStylePr>
   </w:style>
@@ -4089,8 +4973,8 @@
     <w:name w:val="KeywordTok"/>
     <w:basedOn w:val="VerbatimChar"/>
     <w:rPr>
+      <w:color w:val="007020"/>
       <w:b/>
-      <w:color w:val="007020"/>
     </w:rPr>
   </w:style>
   <w:style w:type="character" w:customStyle="1" w:styleId="DataTypeTok">
@@ -4167,42 +5051,42 @@
     <w:name w:val="ImportTok"/>
     <w:basedOn w:val="VerbatimChar"/>
     <w:rPr>
+      <w:color w:val="008000"/>
       <w:b/>
-      <w:color w:val="008000"/>
     </w:rPr>
   </w:style>
   <w:style w:type="character" w:customStyle="1" w:styleId="CommentTok">
     <w:name w:val="CommentTok"/>
     <w:basedOn w:val="VerbatimChar"/>
     <w:rPr>
+      <w:color w:val="60a0b0"/>
       <w:i/>
-      <w:color w:val="60a0b0"/>
     </w:rPr>
   </w:style>
   <w:style w:type="character" w:customStyle="1" w:styleId="DocumentationTok">
     <w:name w:val="DocumentationTok"/>
     <w:basedOn w:val="VerbatimChar"/>
     <w:rPr>
+      <w:color w:val="ba2121"/>
       <w:i/>
-      <w:color w:val="ba2121"/>
     </w:rPr>
   </w:style>
   <w:style w:type="character" w:customStyle="1" w:styleId="AnnotationTok">
     <w:name w:val="AnnotationTok"/>
     <w:basedOn w:val="VerbatimChar"/>
     <w:rPr>
+      <w:color w:val="60a0b0"/>
       <w:b/>
       <w:i/>
-      <w:color w:val="60a0b0"/>
     </w:rPr>
   </w:style>
   <w:style w:type="character" w:customStyle="1" w:styleId="CommentVarTok">
     <w:name w:val="CommentVarTok"/>
     <w:basedOn w:val="VerbatimChar"/>
     <w:rPr>
+      <w:color w:val="60a0b0"/>
       <w:b/>
       <w:i/>
-      <w:color w:val="60a0b0"/>
     </w:rPr>
   </w:style>
   <w:style w:type="character" w:customStyle="1" w:styleId="OtherTok">
@@ -4230,8 +5114,8 @@
     <w:name w:val="ControlFlowTok"/>
     <w:basedOn w:val="VerbatimChar"/>
     <w:rPr>
+      <w:color w:val="007020"/>
       <w:b/>
-      <w:color w:val="007020"/>
     </w:rPr>
   </w:style>
   <w:style w:type="character" w:customStyle="1" w:styleId="OperatorTok">
@@ -4276,34 +5160,34 @@
     <w:name w:val="InformationTok"/>
     <w:basedOn w:val="VerbatimChar"/>
     <w:rPr>
+      <w:color w:val="60a0b0"/>
       <w:b/>
       <w:i/>
-      <w:color w:val="60a0b0"/>
     </w:rPr>
   </w:style>
   <w:style w:type="character" w:customStyle="1" w:styleId="WarningTok">
     <w:name w:val="WarningTok"/>
     <w:basedOn w:val="VerbatimChar"/>
     <w:rPr>
+      <w:color w:val="60a0b0"/>
       <w:b/>
       <w:i/>
-      <w:color w:val="60a0b0"/>
     </w:rPr>
   </w:style>
   <w:style w:type="character" w:customStyle="1" w:styleId="AlertTok">
     <w:name w:val="AlertTok"/>
     <w:basedOn w:val="VerbatimChar"/>
     <w:rPr>
+      <w:color w:val="ff0000"/>
       <w:b/>
-      <w:color w:val="ff0000"/>
     </w:rPr>
   </w:style>
   <w:style w:type="character" w:customStyle="1" w:styleId="ErrorTok">
     <w:name w:val="ErrorTok"/>
     <w:basedOn w:val="VerbatimChar"/>
     <w:rPr>
+      <w:color w:val="ff0000"/>
       <w:b/>
-      <w:color w:val="ff0000"/>
     </w:rPr>
   </w:style>
   <w:style w:type="character" w:customStyle="1" w:styleId="NormalTok">
@@ -4325,44 +5209,44 @@
         <a:sysClr val="window" lastClr="FFFFFF"/>
       </a:lt1>
       <a:dk2>
-        <a:srgbClr val="0E2841"/>
+        <a:srgbClr val="1F497D"/>
       </a:dk2>
       <a:lt2>
-        <a:srgbClr val="E8E8E8"/>
+        <a:srgbClr val="EEECE1"/>
       </a:lt2>
       <a:accent1>
-        <a:srgbClr val="156082"/>
+        <a:srgbClr val="4F81BD"/>
       </a:accent1>
       <a:accent2>
-        <a:srgbClr val="E97132"/>
+        <a:srgbClr val="C0504D"/>
       </a:accent2>
       <a:accent3>
-        <a:srgbClr val="196B24"/>
+        <a:srgbClr val="9BBB59"/>
       </a:accent3>
       <a:accent4>
-        <a:srgbClr val="0F9ED5"/>
+        <a:srgbClr val="8064A2"/>
       </a:accent4>
       <a:accent5>
-        <a:srgbClr val="A02B93"/>
+        <a:srgbClr val="4BACC6"/>
       </a:accent5>
       <a:accent6>
-        <a:srgbClr val="4EA72E"/>
+        <a:srgbClr val="F79646"/>
       </a:accent6>
       <a:hlink>
-        <a:srgbClr val="467886"/>
+        <a:srgbClr val="0000FF"/>
       </a:hlink>
       <a:folHlink>
-        <a:srgbClr val="96607D"/>
+        <a:srgbClr val="800080"/>
       </a:folHlink>
     </a:clrScheme>
     <a:fontScheme name="Office">
       <a:majorFont>
-        <a:latin typeface="Aptos Display" panose="02110004020202020204"/>
+        <a:latin typeface="Calibri"/>
         <a:ea typeface=""/>
         <a:cs typeface=""/>
-        <a:font script="Jpan" typeface="游ゴシック Light"/>
+        <a:font script="Jpan" typeface="ＭＳ ゴシック"/>
         <a:font script="Hang" typeface="맑은 고딕"/>
-        <a:font script="Hans" typeface="等线 Light"/>
+        <a:font script="Hans" typeface="宋体"/>
         <a:font script="Hant" typeface="新細明體"/>
         <a:font script="Arab" typeface="Times New Roman"/>
         <a:font script="Hebr" typeface="Times New Roman"/>
@@ -4389,32 +5273,14 @@
         <a:font script="Mong" typeface="Mongolian Baiti"/>
         <a:font script="Viet" typeface="Times New Roman"/>
         <a:font script="Uigh" typeface="Microsoft Uighur"/>
-        <a:font script="Geor" typeface="Sylfaen"/>
-        <a:font script="Armn" typeface="Arial"/>
-        <a:font script="Bugi" typeface="Leelawadee UI"/>
-        <a:font script="Bopo" typeface="Microsoft JhengHei"/>
-        <a:font script="Java" typeface="Javanese Text"/>
-        <a:font script="Lisu" typeface="Segoe UI"/>
-        <a:font script="Mymr" typeface="Myanmar Text"/>
-        <a:font script="Nkoo" typeface="Ebrima"/>
-        <a:font script="Olck" typeface="Nirmala UI"/>
-        <a:font script="Osma" typeface="Ebrima"/>
-        <a:font script="Phag" typeface="Phagspa"/>
-        <a:font script="Syrn" typeface="Estrangelo Edessa"/>
-        <a:font script="Syrj" typeface="Estrangelo Edessa"/>
-        <a:font script="Syre" typeface="Estrangelo Edessa"/>
-        <a:font script="Sora" typeface="Nirmala UI"/>
-        <a:font script="Tale" typeface="Microsoft Tai Le"/>
-        <a:font script="Talu" typeface="Microsoft New Tai Lue"/>
-        <a:font script="Tfng" typeface="Ebrima"/>
       </a:majorFont>
       <a:minorFont>
-        <a:latin typeface="Aptos" panose="02110004020202020204"/>
+        <a:latin typeface="Cambria"/>
         <a:ea typeface=""/>
         <a:cs typeface=""/>
-        <a:font script="Jpan" typeface="游明朝"/>
+        <a:font script="Jpan" typeface="ＭＳ 明朝"/>
         <a:font script="Hang" typeface="맑은 고딕"/>
-        <a:font script="Hans" typeface="等线"/>
+        <a:font script="Hans" typeface="宋体"/>
         <a:font script="Hant" typeface="新細明體"/>
         <a:font script="Arab" typeface="Arial"/>
         <a:font script="Hebr" typeface="Arial"/>
@@ -4441,24 +5307,6 @@
         <a:font script="Mong" typeface="Mongolian Baiti"/>
         <a:font script="Viet" typeface="Arial"/>
         <a:font script="Uigh" typeface="Microsoft Uighur"/>
-        <a:font script="Geor" typeface="Sylfaen"/>
-        <a:font script="Armn" typeface="Arial"/>
-        <a:font script="Bugi" typeface="Leelawadee UI"/>
-        <a:font script="Bopo" typeface="Microsoft JhengHei"/>
-        <a:font script="Java" typeface="Javanese Text"/>
-        <a:font script="Lisu" typeface="Segoe UI"/>
-        <a:font script="Mymr" typeface="Myanmar Text"/>
-        <a:font script="Nkoo" typeface="Ebrima"/>
-        <a:font script="Olck" typeface="Nirmala UI"/>
-        <a:font script="Osma" typeface="Ebrima"/>
-        <a:font script="Phag" typeface="Phagspa"/>
-        <a:font script="Syrn" typeface="Estrangelo Edessa"/>
-        <a:font script="Syrj" typeface="Estrangelo Edessa"/>
-        <a:font script="Syre" typeface="Estrangelo Edessa"/>
-        <a:font script="Sora" typeface="Nirmala UI"/>
-        <a:font script="Tale" typeface="Microsoft Tai Le"/>
-        <a:font script="Talu" typeface="Microsoft New Tai Lue"/>
-        <a:font script="Tfng" typeface="Ebrima"/>
       </a:minorFont>
     </a:fontScheme>
     <a:fmtScheme name="Office">
@@ -4470,141 +5318,200 @@
           <a:gsLst>
             <a:gs pos="0">
               <a:schemeClr val="phClr">
-                <a:lumMod val="110000"/>
-                <a:satMod val="105000"/>
-                <a:tint val="67000"/>
+                <a:tint val="50000"/>
+                <a:satMod val="300000"/>
               </a:schemeClr>
             </a:gs>
-            <a:gs pos="50000">
+            <a:gs pos="35000">
               <a:schemeClr val="phClr">
-                <a:lumMod val="105000"/>
-                <a:satMod val="103000"/>
-                <a:tint val="73000"/>
+                <a:tint val="37000"/>
+                <a:satMod val="300000"/>
               </a:schemeClr>
             </a:gs>
             <a:gs pos="100000">
               <a:schemeClr val="phClr">
-                <a:lumMod val="105000"/>
-                <a:satMod val="109000"/>
-                <a:tint val="81000"/>
+                <a:tint val="15000"/>
+                <a:satMod val="350000"/>
               </a:schemeClr>
             </a:gs>
           </a:gsLst>
-          <a:lin ang="5400000" scaled="0"/>
+          <a:lin ang="16200000" scaled="1"/>
         </a:gradFill>
         <a:gradFill rotWithShape="1">
           <a:gsLst>
             <a:gs pos="0">
               <a:schemeClr val="phClr">
-                <a:satMod val="103000"/>
-                <a:lumMod val="102000"/>
-                <a:tint val="94000"/>
-              </a:schemeClr>
-            </a:gs>
-            <a:gs pos="50000">
-              <a:schemeClr val="phClr">
-                <a:satMod val="110000"/>
-                <a:lumMod val="100000"/>
+                <a:tint val="100000"/>
                 <a:shade val="100000"/>
+                <a:satMod val="130000"/>
               </a:schemeClr>
             </a:gs>
             <a:gs pos="100000">
               <a:schemeClr val="phClr">
-                <a:lumMod val="99000"/>
-                <a:satMod val="120000"/>
-                <a:shade val="78000"/>
+                <a:tint val="50000"/>
+                <a:shade val="100000"/>
+                <a:satMod val="350000"/>
               </a:schemeClr>
             </a:gs>
           </a:gsLst>
-          <a:lin ang="5400000" scaled="0"/>
+          <a:lin ang="16200000" scaled="0"/>
         </a:gradFill>
       </a:fillStyleLst>
       <a:lnStyleLst>
-        <a:ln w="6350" cap="flat" cmpd="sng" algn="ctr">
+        <a:ln w="9525" cap="flat" cmpd="sng" algn="ctr">
+          <a:solidFill>
+            <a:schemeClr val="phClr">
+              <a:shade val="95000"/>
+              <a:satMod val="105000"/>
+            </a:schemeClr>
+          </a:solidFill>
+          <a:prstDash val="solid"/>
+        </a:ln>
+        <a:ln w="25400" cap="flat" cmpd="sng" algn="ctr">
           <a:solidFill>
             <a:schemeClr val="phClr"/>
           </a:solidFill>
           <a:prstDash val="solid"/>
-          <a:miter lim="800000"/>
         </a:ln>
-        <a:ln w="12700" cap="flat" cmpd="sng" algn="ctr">
+        <a:ln w="38100" cap="flat" cmpd="sng" algn="ctr">
           <a:solidFill>
             <a:schemeClr val="phClr"/>
           </a:solidFill>
           <a:prstDash val="solid"/>
-          <a:miter lim="800000"/>
-        </a:ln>
-        <a:ln w="19050" cap="flat" cmpd="sng" algn="ctr">
-          <a:solidFill>
-            <a:schemeClr val="phClr"/>
-          </a:solidFill>
-          <a:prstDash val="solid"/>
-          <a:miter lim="800000"/>
         </a:ln>
       </a:lnStyleLst>
       <a:effectStyleLst>
         <a:effectStyle>
-          <a:effectLst/>
-        </a:effectStyle>
-        <a:effectStyle>
-          <a:effectLst/>
+          <a:effectLst>
+            <a:outerShdw blurRad="40000" dist="20000" dir="5400000" rotWithShape="0">
+              <a:srgbClr val="000000">
+                <a:alpha val="38000"/>
+              </a:srgbClr>
+            </a:outerShdw>
+          </a:effectLst>
         </a:effectStyle>
         <a:effectStyle>
           <a:effectLst>
-            <a:outerShdw blurRad="57150" dist="19050" dir="5400000" algn="ctr" rotWithShape="0">
+            <a:outerShdw blurRad="40000" dist="23000" dir="5400000" rotWithShape="0">
               <a:srgbClr val="000000">
-                <a:alpha val="63000"/>
+                <a:alpha val="35000"/>
               </a:srgbClr>
             </a:outerShdw>
           </a:effectLst>
+        </a:effectStyle>
+        <a:effectStyle>
+          <a:effectLst>
+            <a:outerShdw blurRad="40000" dist="23000" dir="5400000" rotWithShape="0">
+              <a:srgbClr val="000000">
+                <a:alpha val="35000"/>
+              </a:srgbClr>
+            </a:outerShdw>
+          </a:effectLst>
+          <a:scene3d>
+            <a:camera prst="orthographicFront">
+              <a:rot lat="0" lon="0" rev="0"/>
+            </a:camera>
+            <a:lightRig rig="threePt" dir="t">
+              <a:rot lat="0" lon="0" rev="1200000"/>
+            </a:lightRig>
+          </a:scene3d>
+          <a:sp3d>
+            <a:bevelT w="63500" h="25400"/>
+          </a:sp3d>
         </a:effectStyle>
       </a:effectStyleLst>
       <a:bgFillStyleLst>
         <a:solidFill>
           <a:schemeClr val="phClr"/>
         </a:solidFill>
-        <a:solidFill>
-          <a:schemeClr val="phClr">
-            <a:tint val="95000"/>
-            <a:satMod val="170000"/>
-          </a:schemeClr>
-        </a:solidFill>
         <a:gradFill rotWithShape="1">
           <a:gsLst>
             <a:gs pos="0">
               <a:schemeClr val="phClr">
-                <a:tint val="93000"/>
-                <a:satMod val="150000"/>
-                <a:shade val="98000"/>
-                <a:lumMod val="102000"/>
+                <a:tint val="40000"/>
+                <a:satMod val="350000"/>
               </a:schemeClr>
             </a:gs>
-            <a:gs pos="50000">
+            <a:gs pos="40000">
               <a:schemeClr val="phClr">
-                <a:tint val="98000"/>
-                <a:satMod val="130000"/>
-                <a:shade val="90000"/>
-                <a:lumMod val="103000"/>
+                <a:tint val="45000"/>
+                <a:shade val="99000"/>
+                <a:satMod val="350000"/>
               </a:schemeClr>
             </a:gs>
             <a:gs pos="100000">
               <a:schemeClr val="phClr">
-                <a:shade val="63000"/>
-                <a:satMod val="120000"/>
+                <a:shade val="20000"/>
+                <a:satMod val="255000"/>
               </a:schemeClr>
             </a:gs>
           </a:gsLst>
-          <a:lin ang="5400000" scaled="0"/>
+          <a:path path="circle">
+            <a:fillToRect l="50000" t="-80000" r="50000" b="180000"/>
+          </a:path>
+        </a:gradFill>
+        <a:gradFill rotWithShape="1">
+          <a:gsLst>
+            <a:gs pos="0">
+              <a:schemeClr val="phClr">
+                <a:tint val="80000"/>
+                <a:satMod val="300000"/>
+              </a:schemeClr>
+            </a:gs>
+            <a:gs pos="100000">
+              <a:schemeClr val="phClr">
+                <a:shade val="30000"/>
+                <a:satMod val="200000"/>
+              </a:schemeClr>
+            </a:gs>
+          </a:gsLst>
+          <a:path path="circle">
+            <a:fillToRect l="50000" t="50000" r="50000" b="50000"/>
+          </a:path>
         </a:gradFill>
       </a:bgFillStyleLst>
     </a:fmtScheme>
   </a:themeElements>
-  <a:objectDefaults/>
+  <a:objectDefaults>
+    <a:spDef>
+      <a:spPr/>
+      <a:bodyPr/>
+      <a:lstStyle/>
+      <a:style>
+        <a:lnRef idx="1">
+          <a:schemeClr val="accent1"/>
+        </a:lnRef>
+        <a:fillRef idx="3">
+          <a:schemeClr val="accent1"/>
+        </a:fillRef>
+        <a:effectRef idx="2">
+          <a:schemeClr val="accent1"/>
+        </a:effectRef>
+        <a:fontRef idx="minor">
+          <a:schemeClr val="lt1"/>
+        </a:fontRef>
+      </a:style>
+    </a:spDef>
+    <a:lnDef>
+      <a:spPr/>
+      <a:bodyPr/>
+      <a:lstStyle/>
+      <a:style>
+        <a:lnRef idx="2">
+          <a:schemeClr val="accent1"/>
+        </a:lnRef>
+        <a:fillRef idx="0">
+          <a:schemeClr val="accent1"/>
+        </a:fillRef>
+        <a:effectRef idx="1">
+          <a:schemeClr val="accent1"/>
+        </a:effectRef>
+        <a:fontRef idx="minor">
+          <a:schemeClr val="tx1"/>
+        </a:fontRef>
+      </a:style>
+    </a:lnDef>
+  </a:objectDefaults>
   <a:extraClrSchemeLst/>
-  <a:extLst>
-    <a:ext uri="{05A4C25C-085E-4340-85A3-A5531E510DB2}">
-      <thm15:themeFamily xmlns:thm15="http://schemas.microsoft.com/office/thememl/2012/main" name="Office Theme" id="{2E142A2C-CD16-42D6-873A-C26D2A0506FA}" vid="{1BDDFF52-6CD6-40A5-AB3C-68EB2F1E4D0A}"/>
-    </a:ext>
-  </a:extLst>
 </a:theme>
 </file>
</xml_diff>